<commit_message>
docs update, first set of core evolutions, and MXL-006-PRO figures and material
</commit_message>
<xml_diff>
--- a/docs/photonic_cooling/MXL-006-PRO/Update/MXL-006_update_memo.docx
+++ b/docs/photonic_cooling/MXL-006-PRO/Update/MXL-006_update_memo.docx
@@ -1352,7 +1352,100 @@
               <w:t xml:space="preserve"> </w:t>
             </w:r>
             <w:r>
-              <w:t xml:space="preserve">on the CPU die is 29 W/mm² (a cALU). Restate as: the extractor’s cooling density exceeds the die’s demand by two orders of magnitude, so the array’s limit on this class of die is energy conservation, not the film.</w:t>
+              <w:t xml:space="preserve">on the CPU die is 29 W/mm² (a cALU).</w:t>
+            </w:r>
+            <w:r>
+              <w:t xml:space="preserve"> </w:t>
+            </w:r>
+            <w:r>
+              <w:rPr>
+                <w:b/>
+              </w:rPr>
+              <w:t xml:space="preserve">Measured 13 Sep on densified clusters (§P0.32):</w:t>
+            </w:r>
+            <w:r>
+              <w:t xml:space="preserve"> </w:t>
+            </w:r>
+            <w:r>
+              <w:t xml:space="preserve">a</w:t>
+            </w:r>
+            <w:r>
+              <w:t xml:space="preserve"> </w:t>
+            </w:r>
+            <w:r>
+              <w:rPr>
+                <w:b/>
+              </w:rPr>
+              <w:t xml:space="preserve">230 W/mm² cALU</w:t>
+            </w:r>
+            <w:r>
+              <w:t xml:space="preserve"> </w:t>
+            </w:r>
+            <w:r>
+              <w:t xml:space="preserve">(8× the reference’s density) is held to the 2.00-equivalent rung (202 W of die power) at 5–20 µm burial and 100–200 µm tile pitch; a</w:t>
+            </w:r>
+            <w:r>
+              <w:t xml:space="preserve"> </w:t>
+            </w:r>
+            <w:r>
+              <w:rPr>
+                <w:b/>
+              </w:rPr>
+              <w:t xml:space="preserve">460 W/mm² cALU</w:t>
+            </w:r>
+            <w:r>
+              <w:t xml:space="preserve"> </w:t>
+            </w:r>
+            <w:r>
+              <w:t xml:space="preserve">(16×) only at 100 µm pitch; the top rung is lost at coarse pitch to energy conservation and at fine pitch to</w:t>
+            </w:r>
+            <w:r>
+              <w:t xml:space="preserve"> </w:t>
+            </w:r>
+            <w:r>
+              <w:rPr>
+                <w:b/>
+              </w:rPr>
+              <w:t xml:space="preserve">the film’s own cold end</w:t>
+            </w:r>
+            <w:r>
+              <w:t xml:space="preserve"> </w:t>
+            </w:r>
+            <w:r>
+              <w:t xml:space="preserve">— the tile above the cluster is driven to 253–254 K, where the dye’s capability has collapsed, while 170–200 W/mm² is asked of it. So the film’s capability</w:t>
+            </w:r>
+            <w:r>
+              <w:t xml:space="preserve"> </w:t>
+            </w:r>
+            <w:r>
+              <w:rPr>
+                <w:i/>
+              </w:rPr>
+              <w:t xml:space="preserve">does</w:t>
+            </w:r>
+            <w:r>
+              <w:t xml:space="preserve"> </w:t>
+            </w:r>
+            <w:r>
+              <w:t xml:space="preserve">bind on a several-hundred-W/mm² unit, at a fifth of its 300 K rating; the honest form is</w:t>
+            </w:r>
+            <w:r>
+              <w:t xml:space="preserve"> </w:t>
+            </w:r>
+            <w:r>
+              <w:t xml:space="preserve">“</w:t>
+            </w:r>
+            <w:r>
+              <w:t xml:space="preserve">functional units at 200–450 W/mm² held by the array, with the tile pitch resolving the unit</w:t>
+            </w:r>
+            <w:r>
+              <w:t xml:space="preserve">”</w:t>
+            </w:r>
+            <w:r>
+              <w:t xml:space="preserve"> </w:t>
+            </w:r>
+            <w:r>
+              <w:t xml:space="preserve">— not &gt; 1000, and the die’s own supply rails carry 8–16× the reference’s current density there (Section 4.6).</w:t>
             </w:r>
           </w:p>
         </w:tc>
@@ -1422,7 +1515,22 @@
               <w:t xml:space="preserve"> </w:t>
             </w:r>
             <w:r>
-              <w:t xml:space="preserve">at 0.77 V (10 % overdrive on the ASAP7 card) and 5.0 GHz on the shipped table. Cooling turns thermal headroom into clock</w:t>
+              <w:t xml:space="preserve">at 0.77 V (10 % overdrive on the ASAP7 card, the</w:t>
+            </w:r>
+            <w:r>
+              <w:t xml:space="preserve"> </w:t>
+            </w:r>
+            <w:r>
+              <w:rPr>
+                <w:i/>
+              </w:rPr>
+              <w:t xml:space="preserve">gate-only</w:t>
+            </w:r>
+            <w:r>
+              <w:t xml:space="preserve"> </w:t>
+            </w:r>
+            <w:r>
+              <w:t xml:space="preserve">model) and 5.0 GHz on the shipped table. Cooling turns thermal headroom into clock</w:t>
             </w:r>
             <w:r>
               <w:t xml:space="preserve"> </w:t>
@@ -1437,7 +1545,139 @@
               <w:t xml:space="preserve"> </w:t>
             </w:r>
             <w:r>
-              <w:t xml:space="preserve">that ceiling (+14 % at 1.00 W/mm², +26 % at 1.20, +34 % on the table) and no further; above the table nothing thermal stops the laser arm because the voltage is clamped, and that is a model artefact, not a clock. v100 §10.5 says the same (cubic scaling; the linear regime ends at V_th). Remove the number.</w:t>
+              <w:t xml:space="preserve">that ceiling (+14 % at 1.00 W/mm², +26 % at 1.20, +34 % on the table) and no further; above the table nothing thermal stops the laser arm because the voltage is clamped, and that is a model artefact, not a clock.</w:t>
+            </w:r>
+            <w:r>
+              <w:t xml:space="preserve"> </w:t>
+            </w:r>
+            <w:r>
+              <w:rPr>
+                <w:b/>
+              </w:rPr>
+              <w:t xml:space="preserve">Generalized 13 Sep (§P0.31):</w:t>
+            </w:r>
+            <w:r>
+              <w:t xml:space="preserve"> </w:t>
+            </w:r>
+            <w:r>
+              <w:t xml:space="preserve">with wire, clock skew and setup/jitter in the period and the supply limit set by an electromigration / dielectric-breakdown lifetime budget at the</w:t>
+            </w:r>
+            <w:r>
+              <w:t xml:space="preserve"> </w:t>
+            </w:r>
+            <w:r>
+              <w:rPr>
+                <w:i/>
+              </w:rPr>
+              <w:t xml:space="preserve">cooled</w:t>
+            </w:r>
+            <w:r>
+              <w:t xml:space="preserve"> </w:t>
+            </w:r>
+            <w:r>
+              <w:t xml:space="preserve">temperature instead of a fixed overdrive, the same 10 % overdrive buys</w:t>
+            </w:r>
+            <w:r>
+              <w:t xml:space="preserve"> </w:t>
+            </w:r>
+            <w:r>
+              <w:rPr>
+                <w:b/>
+              </w:rPr>
+              <w:t xml:space="preserve">+1.6 % of clock at the array’s 92 °C target</w:t>
+            </w:r>
+            <w:r>
+              <w:t xml:space="preserve"> </w:t>
+            </w:r>
+            <w:r>
+              <w:t xml:space="preserve">(3.84 GHz on a 20-FO4 pipeline); a die held at 60 °C buys +8 %, at 27 °C +16 %; and</w:t>
+            </w:r>
+            <w:r>
+              <w:t xml:space="preserve"> </w:t>
+            </w:r>
+            <w:r>
+              <w:rPr>
+                <w:b/>
+              </w:rPr>
+              <w:t xml:space="preserve">10 GHz needs a 6–7 FO4-per-stage pipeline</w:t>
+            </w:r>
+            <w:r>
+              <w:t xml:space="preserve"> </w:t>
+            </w:r>
+            <w:r>
+              <w:t xml:space="preserve">(Pentium-4 class) on this device at any temperature — the cooler is not what stands between this core and 10 GHz. The coupled search under that model (</w:t>
+            </w:r>
+            <w:r>
+              <w:rPr>
+                <w:rStyle w:val="VerbatimChar"/>
+              </w:rPr>
+              <w:t xml:space="preserve">clock_fmax.json</w:t>
+            </w:r>
+            <w:r>
+              <w:t xml:space="preserve">) puts the laser arm at</w:t>
+            </w:r>
+            <w:r>
+              <w:t xml:space="preserve"> </w:t>
+            </w:r>
+            <w:r>
+              <w:rPr>
+                <w:b/>
+              </w:rPr>
+              <w:t xml:space="preserve">3.76 GHz at the 92 °C target</w:t>
+            </w:r>
+            <w:r>
+              <w:t xml:space="preserve"> </w:t>
+            </w:r>
+            <w:r>
+              <w:t xml:space="preserve">(+7 % over the control at 1.00 W/mm², +15 % at 1.20; TDDB-limited),</w:t>
+            </w:r>
+            <w:r>
+              <w:t xml:space="preserve"> </w:t>
+            </w:r>
+            <w:r>
+              <w:rPr>
+                <w:b/>
+              </w:rPr>
+              <w:t xml:space="preserve">4.08 GHz at a 60 °C target</w:t>
+            </w:r>
+            <w:r>
+              <w:t xml:space="preserve"> </w:t>
+            </w:r>
+            <w:r>
+              <w:t xml:space="preserve">for 104 W of removal, and</w:t>
+            </w:r>
+            <w:r>
+              <w:t xml:space="preserve"> </w:t>
+            </w:r>
+            <w:r>
+              <w:rPr>
+                <w:b/>
+              </w:rPr>
+              <w:t xml:space="preserve">5.75 GHz on a 10-FO4 pipeline, where the cooler binds again</w:t>
+            </w:r>
+            <w:r>
+              <w:t xml:space="preserve"> </w:t>
+            </w:r>
+            <w:r>
+              <w:t xml:space="preserve">(283 W of die power, 259 W lifted, the next step runs away). In instructions per second the recorded +14 / +26 % clock gains are +11 / +21 % (CoMeT’s measured IPC(f), §P0.33). v100 §10.5 says the same (cubic scaling; the linear regime ends at V_th). Remove the number; claim</w:t>
+            </w:r>
+            <w:r>
+              <w:t xml:space="preserve"> </w:t>
+            </w:r>
+            <w:r>
+              <w:t xml:space="preserve">“</w:t>
+            </w:r>
+            <w:r>
+              <w:t xml:space="preserve">clock to the device’s reliability-budgeted ceiling</w:t>
+            </w:r>
+            <w:r>
+              <w:t xml:space="preserve">”</w:t>
+            </w:r>
+            <w:r>
+              <w:t xml:space="preserve"> </w:t>
+            </w:r>
+            <w:r>
+              <w:t xml:space="preserve">(Section 6.3).</w:t>
             </w:r>
           </w:p>
         </w:tc>
@@ -3669,7 +3909,7 @@
           <wp:inline>
             <wp:extent cx="5334000" cy="2364298"/>
             <wp:effectExtent b="0" l="0" r="0" t="0"/>
-            <wp:docPr descr="Figure 4.3 — Clock as the free variable (F1c)." title="" id="1" name="Picture"/>
+            <wp:docPr descr="Figure 4.3 — Clock as the free variable (F1c). The 4.17 GHz line is the gate-only model’s ceiling." title="" id="1" name="Picture"/>
             <a:graphic>
               <a:graphicData uri="http://schemas.openxmlformats.org/drawingml/2006/picture">
                 <pic:pic>
@@ -3712,7 +3952,117 @@
         <w:pStyle w:val="ImageCaption"/>
       </w:pPr>
       <w:r>
-        <w:t xml:space="preserve">Figure 4.3 — Clock as the free variable (F1c).</w:t>
+        <w:t xml:space="preserve">Figure 4.3 — Clock as the free variable (F1c). The 4.17 GHz line is the gate-only model’s ceiling.</w:t>
+      </w:r>
+    </w:p>
+    <w:p>
+      <w:pPr>
+        <w:pStyle w:val="CaptionedFigure"/>
+      </w:pPr>
+      <w:r>
+        <w:drawing>
+          <wp:inline>
+            <wp:extent cx="5334000" cy="2134172"/>
+            <wp:effectExtent b="0" l="0" r="0" t="0"/>
+            <wp:docPr descr="Figure 4.3b — The clock search generalized (§P0.31, 13 Sep): the reliability budget as an Arrhenius ladder (left) and the coupled search with each row’s limiter named (right). The laser arm ends at 3.76–3.83 GHz at the 92 °C target, 4.08 GHz at a 60 °C target, 5.75 GHz on a 10-FO4 pipeline where the cooler binds again." title="" id="1" name="Picture"/>
+            <a:graphic>
+              <a:graphicData uri="http://schemas.openxmlformats.org/drawingml/2006/picture">
+                <pic:pic>
+                  <pic:nvPicPr>
+                    <pic:cNvPr descr="figures/ev_fmax_generalized.png" id="0" name="Picture"/>
+                    <pic:cNvPicPr>
+                      <a:picLocks noChangeArrowheads="1" noChangeAspect="1"/>
+                    </pic:cNvPicPr>
+                  </pic:nvPicPr>
+                  <pic:blipFill>
+                    <a:blip r:embed="rId31"/>
+                    <a:stretch>
+                      <a:fillRect/>
+                    </a:stretch>
+                  </pic:blipFill>
+                  <pic:spPr bwMode="auto">
+                    <a:xfrm>
+                      <a:off x="0" y="0"/>
+                      <a:ext cx="5334000" cy="2134172"/>
+                    </a:xfrm>
+                    <a:prstGeom prst="rect">
+                      <a:avLst/>
+                    </a:prstGeom>
+                    <a:noFill/>
+                    <a:ln w="9525">
+                      <a:noFill/>
+                      <a:headEnd/>
+                      <a:tailEnd/>
+                    </a:ln>
+                  </pic:spPr>
+                </pic:pic>
+              </a:graphicData>
+            </a:graphic>
+          </wp:inline>
+        </w:drawing>
+      </w:r>
+    </w:p>
+    <w:p>
+      <w:pPr>
+        <w:pStyle w:val="ImageCaption"/>
+      </w:pPr>
+      <w:r>
+        <w:t xml:space="preserve">Figure 4.3b — The clock search generalized (§P0.31, 13 Sep): the reliability budget as an Arrhenius ladder (left) and the coupled search with each row’s limiter named (right). The laser arm ends at 3.76–3.83 GHz at the 92 °C target, 4.08 GHz at a 60 °C target, 5.75 GHz on a 10-FO4 pipeline where the cooler binds again.</w:t>
+      </w:r>
+    </w:p>
+    <w:p>
+      <w:pPr>
+        <w:pStyle w:val="CaptionedFigure"/>
+      </w:pPr>
+      <w:r>
+        <w:drawing>
+          <wp:inline>
+            <wp:extent cx="5334000" cy="2341926"/>
+            <wp:effectExtent b="0" l="0" r="0" t="0"/>
+            <wp:docPr descr="Figure 4.3c — IPC(f) from CoMeT (§P0.33): a fifth of every clock gain is lost to the memory wall (elasticity 0.78–0.84 at the F1c clocks)." title="" id="1" name="Picture"/>
+            <a:graphic>
+              <a:graphicData uri="http://schemas.openxmlformats.org/drawingml/2006/picture">
+                <pic:pic>
+                  <pic:nvPicPr>
+                    <pic:cNvPr descr="figures/ev_ipc_of_f.png" id="0" name="Picture"/>
+                    <pic:cNvPicPr>
+                      <a:picLocks noChangeArrowheads="1" noChangeAspect="1"/>
+                    </pic:cNvPicPr>
+                  </pic:nvPicPr>
+                  <pic:blipFill>
+                    <a:blip r:embed="rId32"/>
+                    <a:stretch>
+                      <a:fillRect/>
+                    </a:stretch>
+                  </pic:blipFill>
+                  <pic:spPr bwMode="auto">
+                    <a:xfrm>
+                      <a:off x="0" y="0"/>
+                      <a:ext cx="5334000" cy="2341926"/>
+                    </a:xfrm>
+                    <a:prstGeom prst="rect">
+                      <a:avLst/>
+                    </a:prstGeom>
+                    <a:noFill/>
+                    <a:ln w="9525">
+                      <a:noFill/>
+                      <a:headEnd/>
+                      <a:tailEnd/>
+                    </a:ln>
+                  </pic:spPr>
+                </pic:pic>
+              </a:graphicData>
+            </a:graphic>
+          </wp:inline>
+        </w:drawing>
+      </w:r>
+    </w:p>
+    <w:p>
+      <w:pPr>
+        <w:pStyle w:val="ImageCaption"/>
+      </w:pPr>
+      <w:r>
+        <w:t xml:space="preserve">Figure 4.3c — IPC(f) from CoMeT (§P0.33): a fifth of every clock gain is lost to the memory wall (elasticity 0.78–0.84 at the F1c clocks).</w:t>
       </w:r>
     </w:p>
     <w:p>
@@ -3838,7 +4188,7 @@
                     </pic:cNvPicPr>
                   </pic:nvPicPr>
                   <pic:blipFill>
-                    <a:blip r:embed="rId31"/>
+                    <a:blip r:embed="rId33"/>
                     <a:stretch>
                       <a:fillRect/>
                     </a:stretch>
@@ -3920,7 +4270,7 @@
           <wp:inline>
             <wp:extent cx="5334000" cy="2998137"/>
             <wp:effectExtent b="0" l="0" r="0" t="0"/>
-            <wp:docPr descr="Figure 4.6 — The dense execution cluster at matched watts (D1)." title="" id="1" name="Picture"/>
+            <wp:docPr descr="Figure 4.6 — The dense execution cluster at matched watts (D1, seed-shape planner as recorded)." title="" id="1" name="Picture"/>
             <a:graphic>
               <a:graphicData uri="http://schemas.openxmlformats.org/drawingml/2006/picture">
                 <pic:pic>
@@ -3931,7 +4281,7 @@
                     </pic:cNvPicPr>
                   </pic:nvPicPr>
                   <pic:blipFill>
-                    <a:blip r:embed="rId32"/>
+                    <a:blip r:embed="rId34"/>
                     <a:stretch>
                       <a:fillRect/>
                     </a:stretch>
@@ -3963,7 +4313,117 @@
         <w:pStyle w:val="ImageCaption"/>
       </w:pPr>
       <w:r>
-        <w:t xml:space="preserve">Figure 4.6 — The dense execution cluster at matched watts (D1).</w:t>
+        <w:t xml:space="preserve">Figure 4.6 — The dense execution cluster at matched watts (D1, seed-shape planner as recorded).</w:t>
+      </w:r>
+    </w:p>
+    <w:p>
+      <w:pPr>
+        <w:pStyle w:val="CaptionedFigure"/>
+      </w:pPr>
+      <w:r>
+        <w:drawing>
+          <wp:inline>
+            <wp:extent cx="5334000" cy="2373027"/>
+            <wp:effectExtent b="0" l="0" r="0" t="0"/>
+            <wp:docPr descr="Figure 4.6b — D1 under the per-block planner shape (§P0.34): the 2× cluster holds every rung to 243 W, the 4× holds 202 W; the seed shape’s lost rungs were the planner’s. The ×0.25 at 243 W is envelope-only (s = 1.02)." title="" id="1" name="Picture"/>
+            <a:graphic>
+              <a:graphicData uri="http://schemas.openxmlformats.org/drawingml/2006/picture">
+                <pic:pic>
+                  <pic:nvPicPr>
+                    <pic:cNvPr descr="figures/ev_dense_cluster_per_block.png" id="0" name="Picture"/>
+                    <pic:cNvPicPr>
+                      <a:picLocks noChangeArrowheads="1" noChangeAspect="1"/>
+                    </pic:cNvPicPr>
+                  </pic:nvPicPr>
+                  <pic:blipFill>
+                    <a:blip r:embed="rId35"/>
+                    <a:stretch>
+                      <a:fillRect/>
+                    </a:stretch>
+                  </pic:blipFill>
+                  <pic:spPr bwMode="auto">
+                    <a:xfrm>
+                      <a:off x="0" y="0"/>
+                      <a:ext cx="5334000" cy="2373027"/>
+                    </a:xfrm>
+                    <a:prstGeom prst="rect">
+                      <a:avLst/>
+                    </a:prstGeom>
+                    <a:noFill/>
+                    <a:ln w="9525">
+                      <a:noFill/>
+                      <a:headEnd/>
+                      <a:tailEnd/>
+                    </a:ln>
+                  </pic:spPr>
+                </pic:pic>
+              </a:graphicData>
+            </a:graphic>
+          </wp:inline>
+        </w:drawing>
+      </w:r>
+    </w:p>
+    <w:p>
+      <w:pPr>
+        <w:pStyle w:val="ImageCaption"/>
+      </w:pPr>
+      <w:r>
+        <w:t xml:space="preserve">Figure 4.6b — D1 under the per-block planner shape (§P0.34): the 2× cluster holds every rung to 243 W, the 4× holds 202 W; the seed shape’s lost rungs were the planner’s. The ×0.25 at 243 W is envelope-only (s = 1.02).</w:t>
+      </w:r>
+    </w:p>
+    <w:p>
+      <w:pPr>
+        <w:pStyle w:val="CaptionedFigure"/>
+      </w:pPr>
+      <w:r>
+        <w:drawing>
+          <wp:inline>
+            <wp:extent cx="5334000" cy="2238177"/>
+            <wp:effectExtent b="0" l="0" r="0" t="0"/>
+            <wp:docPr descr="Figure 4.6c — The 8× / 16× clusters at 20 µm and 5 µm burial (§P0.32): pitch, not burial, is the lever; at 100 µm pitch the tile above the cluster is driven to 253 K and the film’s own cold end binds for the first time." title="" id="1" name="Picture"/>
+            <a:graphic>
+              <a:graphicData uri="http://schemas.openxmlformats.org/drawingml/2006/picture">
+                <pic:pic>
+                  <pic:nvPicPr>
+                    <pic:cNvPr descr="figures/ev_cluster_transport.png" id="0" name="Picture"/>
+                    <pic:cNvPicPr>
+                      <a:picLocks noChangeArrowheads="1" noChangeAspect="1"/>
+                    </pic:cNvPicPr>
+                  </pic:nvPicPr>
+                  <pic:blipFill>
+                    <a:blip r:embed="rId36"/>
+                    <a:stretch>
+                      <a:fillRect/>
+                    </a:stretch>
+                  </pic:blipFill>
+                  <pic:spPr bwMode="auto">
+                    <a:xfrm>
+                      <a:off x="0" y="0"/>
+                      <a:ext cx="5334000" cy="2238177"/>
+                    </a:xfrm>
+                    <a:prstGeom prst="rect">
+                      <a:avLst/>
+                    </a:prstGeom>
+                    <a:noFill/>
+                    <a:ln w="9525">
+                      <a:noFill/>
+                      <a:headEnd/>
+                      <a:tailEnd/>
+                    </a:ln>
+                  </pic:spPr>
+                </pic:pic>
+              </a:graphicData>
+            </a:graphic>
+          </wp:inline>
+        </w:drawing>
+      </w:r>
+    </w:p>
+    <w:p>
+      <w:pPr>
+        <w:pStyle w:val="ImageCaption"/>
+      </w:pPr>
+      <w:r>
+        <w:t xml:space="preserve">Figure 4.6c — The 8× / 16× clusters at 20 µm and 5 µm burial (§P0.32): pitch, not burial, is the lever; at 100 µm pitch the tile above the cluster is driven to 253 K and the film’s own cold end binds for the first time.</w:t>
       </w:r>
     </w:p>
     <w:p>
@@ -4027,7 +4487,7 @@
                     </pic:cNvPicPr>
                   </pic:nvPicPr>
                   <pic:blipFill>
-                    <a:blip r:embed="rId33"/>
+                    <a:blip r:embed="rId37"/>
                     <a:stretch>
                       <a:fillRect/>
                     </a:stretch>
@@ -4144,7 +4604,7 @@
                     </pic:cNvPicPr>
                   </pic:nvPicPr>
                   <pic:blipFill>
-                    <a:blip r:embed="rId34"/>
+                    <a:blip r:embed="rId38"/>
                     <a:stretch>
                       <a:fillRect/>
                     </a:stretch>
@@ -4280,11 +4740,11 @@
       <w:pPr>
         <w:pStyle w:val="Heading2"/>
       </w:pPr>
-      <w:bookmarkStart w:id="35" w:name="Xf26f4f5ca7131eebeeb43e40856a5301ad41bda"/>
+      <w:bookmarkStart w:id="39" w:name="Xf26f4f5ca7131eebeeb43e40856a5301ad41bda"/>
       <w:r>
         <w:t xml:space="preserve">5. What was argued and then falsified — the list counsel should know</w:t>
       </w:r>
-      <w:bookmarkEnd w:id="35"/>
+      <w:bookmarkEnd w:id="39"/>
     </w:p>
     <w:p>
       <w:pPr>
@@ -4655,11 +5115,11 @@
       <w:pPr>
         <w:pStyle w:val="Heading2"/>
       </w:pPr>
-      <w:bookmarkStart w:id="36" w:name="X788bd1eeac55d14d57406c416fe7e23dbc40ce8"/>
+      <w:bookmarkStart w:id="40" w:name="X788bd1eeac55d14d57406c416fe7e23dbc40ce8"/>
       <w:r>
         <w:t xml:space="preserve">6. Recommended framing for the specific claims</w:t>
       </w:r>
-      <w:bookmarkEnd w:id="36"/>
+      <w:bookmarkEnd w:id="40"/>
     </w:p>
     <w:p>
       <w:pPr>
@@ -4774,7 +5234,37 @@
         <w:t xml:space="preserve"> </w:t>
       </w:r>
       <w:r>
-        <w:t xml:space="preserve">Operating the die under a thermal limit, bisecting the clock with dynamic power ∝ V²f on the device’s V/F curve and leakage on the coupled solve, driving the array to hold the limit, and stopping at the transistor’s V/F ceiling rather than at the package’s thermal ceiling. Dependent: the operating point stated in W/mm²; the array removing 38–235 W to hold it.</w:t>
+        <w:t xml:space="preserve">Operating the die under a thermal limit, bisecting the clock with dynamic power ∝ V²f on the device’s V/F curve and leakage on the coupled solve, driving the array to hold the limit, and stopping at the transistor’s ceiling rather than at the package’s thermal ceiling — where, as of 13 Sep (§P0.31), that ceiling is</w:t>
+      </w:r>
+      <w:r>
+        <w:t xml:space="preserve"> </w:t>
+      </w:r>
+      <w:r>
+        <w:rPr>
+          <w:b/>
+        </w:rPr>
+        <w:t xml:space="preserve">the supply at which the worst block’s lifetime equals the qualification point’s</w:t>
+      </w:r>
+      <w:r>
+        <w:t xml:space="preserve"> </w:t>
+      </w:r>
+      <w:r>
+        <w:t xml:space="preserve">(electromigration and dielectric breakdown, Arrhenius in the</w:t>
+      </w:r>
+      <w:r>
+        <w:t xml:space="preserve"> </w:t>
+      </w:r>
+      <w:r>
+        <w:rPr>
+          <w:i/>
+        </w:rPr>
+        <w:t xml:space="preserve">cooled</w:t>
+      </w:r>
+      <w:r>
+        <w:t xml:space="preserve"> </w:t>
+      </w:r>
+      <w:r>
+        <w:t xml:space="preserve">temperature) on a period that includes wire, thermal skew and setup/jitter: the array’s target temperature is then the co-design knob (each 30 K it holds below the corner buys ~6 % of supply), and the claim should recite the budget, not a fixed overdrive. Dependent: the operating point stated in W/mm²; the array removing 38–235 W to hold it.</w:t>
       </w:r>
       <w:r>
         <w:t xml:space="preserve"> </w:t>
@@ -5137,11 +5627,11 @@
       <w:pPr>
         <w:pStyle w:val="Heading2"/>
       </w:pPr>
-      <w:bookmarkStart w:id="37" w:name="Xfcff58f8ef26e2bbfdcc6ea756e0cc0aa6ebcfa"/>
+      <w:bookmarkStart w:id="41" w:name="Xfcff58f8ef26e2bbfdcc6ea756e0cc0aa6ebcfa"/>
       <w:r>
         <w:t xml:space="preserve">7. How core designs evolve with targeted laser cooling — the figures</w:t>
       </w:r>
-      <w:bookmarkEnd w:id="37"/>
+      <w:bookmarkEnd w:id="41"/>
     </w:p>
     <w:p>
       <w:pPr>
@@ -5202,7 +5692,44 @@
         <w:t xml:space="preserve"> </w:t>
       </w:r>
       <w:r>
-        <w:t xml:space="preserve">(the status of every claim-relevant statement), and the evidence figures</w:t>
+        <w:t xml:space="preserve">(the status of every claim-relevant statement),</w:t>
+      </w:r>
+      <w:r>
+        <w:t xml:space="preserve"> </w:t>
+      </w:r>
+      <w:r>
+        <w:rPr>
+          <w:b/>
+        </w:rPr>
+        <w:t xml:space="preserve">the patent-style drawings</w:t>
+      </w:r>
+      <w:r>
+        <w:rPr>
+          <w:b/>
+        </w:rPr>
+        <w:t xml:space="preserve"> </w:t>
+      </w:r>
+      <w:r>
+        <w:rPr>
+          <w:rStyle w:val="VerbatimChar"/>
+          <w:b/>
+        </w:rPr>
+        <w:t xml:space="preserve">figures/pat_fig1–8.png</w:t>
+      </w:r>
+      <w:r>
+        <w:rPr>
+          <w:b/>
+        </w:rPr>
+        <w:t xml:space="preserve"> </w:t>
+      </w:r>
+      <w:r>
+        <w:rPr>
+          <w:b/>
+        </w:rPr>
+        <w:t xml:space="preserve">(Section 7A, 13 Sep)</w:t>
+      </w:r>
+      <w:r>
+        <w:t xml:space="preserve">, and the evidence figures</w:t>
       </w:r>
       <w:r>
         <w:t xml:space="preserve"> </w:t>
@@ -5240,7 +5767,7 @@
                     </pic:cNvPicPr>
                   </pic:nvPicPr>
                   <pic:blipFill>
-                    <a:blip r:embed="rId38"/>
+                    <a:blip r:embed="rId42"/>
                     <a:stretch>
                       <a:fillRect/>
                     </a:stretch>
@@ -5329,7 +5856,7 @@
                     </pic:cNvPicPr>
                   </pic:nvPicPr>
                   <pic:blipFill>
-                    <a:blip r:embed="rId39"/>
+                    <a:blip r:embed="rId43"/>
                     <a:stretch>
                       <a:fillRect/>
                     </a:stretch>
@@ -5452,7 +5979,7 @@
                     </pic:cNvPicPr>
                   </pic:nvPicPr>
                   <pic:blipFill>
-                    <a:blip r:embed="rId40"/>
+                    <a:blip r:embed="rId44"/>
                     <a:stretch>
                       <a:fillRect/>
                     </a:stretch>
@@ -5498,11 +6025,2094 @@
       <w:pPr>
         <w:pStyle w:val="Heading2"/>
       </w:pPr>
-      <w:bookmarkStart w:id="41" w:name="experiments-run-for-this-memo"/>
+      <w:bookmarkStart w:id="45" w:name="Xd3b3ff0af6c19a5c6241adc6eec1601d2e35e6c"/>
+      <w:r>
+        <w:t xml:space="preserve">7A. Patent-style drawings: the core evolved in response to localized, high-power-density cooling (13 Sep)</w:t>
+      </w:r>
+      <w:bookmarkEnd w:id="45"/>
+    </w:p>
+    <w:p>
+      <w:pPr>
+        <w:pStyle w:val="FirstParagraph"/>
+      </w:pPr>
+      <w:r>
+        <w:t xml:space="preserve">Eight monochrome sheets with reference numerals, drawn by</w:t>
+      </w:r>
+      <w:r>
+        <w:t xml:space="preserve"> </w:t>
+      </w:r>
+      <w:r>
+        <w:rPr>
+          <w:rStyle w:val="VerbatimChar"/>
+        </w:rPr>
+        <w:t xml:space="preserve">make_patent_figures.py</w:t>
+      </w:r>
+      <w:r>
+        <w:t xml:space="preserve"> </w:t>
+      </w:r>
+      <w:r>
+        <w:t xml:space="preserve">from the real floorplans (</w:t>
+      </w:r>
+      <w:r>
+        <w:rPr>
+          <w:rStyle w:val="VerbatimChar"/>
+        </w:rPr>
+        <w:t xml:space="preserve">examples/floorplans/outputs/…</w:t>
+      </w:r>
+      <w:r>
+        <w:t xml:space="preserve">, one core of the 34-core die at 1×, 1/2, 1/4, 1/8 and 1/16 execution-unit area), the recorded fields and the evidence JSONs where a number appears. Every caption states MEASURED or ARGUED per the register; nothing in a drawing is claimed beyond its caption. The argument they carry, in order: the conventional core is bounded by a leakage runaway through its hottest execution unit and spreads that unit out to survive (FIG. 1); a driven, planner-commanded tile array above the back surface removes the runaway first and then the rungs to conservation (FIG. 2); the execution cluster can then be made 2–16× denser at unchanged power, with the tile pitch matched to the unit (FIG. 3); the rails over it are widened in proportion to its current density and the array’s target is chosen on a lifetime budget, which is the co-design knob for supply and clock (FIG. 4); at fine pitch and the top rung the film’s own cold end binds, which fixes the tile pitch and the hot-zone material as design variables (FIG. 5); the caches are collected on a storage die off the compute die’s heat path (FIG. 6); the composed core (FIG. 7); and the ladder of constraint → cooling → response → next constraint that generated it (FIG. 8).</w:t>
+      </w:r>
+    </w:p>
+    <w:p>
+      <w:pPr>
+        <w:pStyle w:val="CaptionedFigure"/>
+      </w:pPr>
+      <w:r>
+        <w:drawing>
+          <wp:inline>
+            <wp:extent cx="5334000" cy="2804003"/>
+            <wp:effectExtent b="0" l="0" r="0" t="0"/>
+            <wp:docPr descr="FIG. 1 — The conventional core 100 as traced: the execution cluster 110 (112–118) spread among the caches 120–126, the front end 130 and the control slab 140; section A–A′, the direct-die package 200–210. MEASURED (§P0.17; the native field)." title="" id="1" name="Picture"/>
+            <a:graphic>
+              <a:graphicData uri="http://schemas.openxmlformats.org/drawingml/2006/picture">
+                <pic:pic>
+                  <pic:nvPicPr>
+                    <pic:cNvPr descr="figures/pat_fig1.png" id="0" name="Picture"/>
+                    <pic:cNvPicPr>
+                      <a:picLocks noChangeArrowheads="1" noChangeAspect="1"/>
+                    </pic:cNvPicPr>
+                  </pic:nvPicPr>
+                  <pic:blipFill>
+                    <a:blip r:embed="rId46"/>
+                    <a:stretch>
+                      <a:fillRect/>
+                    </a:stretch>
+                  </pic:blipFill>
+                  <pic:spPr bwMode="auto">
+                    <a:xfrm>
+                      <a:off x="0" y="0"/>
+                      <a:ext cx="5334000" cy="2804003"/>
+                    </a:xfrm>
+                    <a:prstGeom prst="rect">
+                      <a:avLst/>
+                    </a:prstGeom>
+                    <a:noFill/>
+                    <a:ln w="9525">
+                      <a:noFill/>
+                      <a:headEnd/>
+                      <a:tailEnd/>
+                    </a:ln>
+                  </pic:spPr>
+                </pic:pic>
+              </a:graphicData>
+            </a:graphic>
+          </wp:inline>
+        </w:drawing>
+      </w:r>
+    </w:p>
+    <w:p>
+      <w:pPr>
+        <w:pStyle w:val="ImageCaption"/>
+      </w:pPr>
+      <w:r>
+        <w:t xml:space="preserve">FIG. 1 — The conventional core 100 as traced: the execution cluster 110 (112–118) spread among the caches 120–126, the front end 130 and the control slab 140; section A–A′, the direct-die package 200–210. MEASURED (§P0.17; the native field).</w:t>
+      </w:r>
+    </w:p>
+    <w:p>
+      <w:pPr>
+        <w:pStyle w:val="CaptionedFigure"/>
+      </w:pPr>
+      <w:r>
+        <w:drawing>
+          <wp:inline>
+            <wp:extent cx="5334000" cy="3317140"/>
+            <wp:effectExtent b="0" l="0" r="0" t="0"/>
+            <wp:docPr descr="FIG. 2 — The apparatus: the photonic cooling layer 300 of tiles 302, pump routing 304, collector 306, and the controller 310 (sense 312 → plan 314 → drive 316). MEASURED: the rescue ladder, 1.20 → 3.50 W/mm² under the per-block planner." title="" id="1" name="Picture"/>
+            <a:graphic>
+              <a:graphicData uri="http://schemas.openxmlformats.org/drawingml/2006/picture">
+                <pic:pic>
+                  <pic:nvPicPr>
+                    <pic:cNvPr descr="figures/pat_fig2.png" id="0" name="Picture"/>
+                    <pic:cNvPicPr>
+                      <a:picLocks noChangeArrowheads="1" noChangeAspect="1"/>
+                    </pic:cNvPicPr>
+                  </pic:nvPicPr>
+                  <pic:blipFill>
+                    <a:blip r:embed="rId47"/>
+                    <a:stretch>
+                      <a:fillRect/>
+                    </a:stretch>
+                  </pic:blipFill>
+                  <pic:spPr bwMode="auto">
+                    <a:xfrm>
+                      <a:off x="0" y="0"/>
+                      <a:ext cx="5334000" cy="3317140"/>
+                    </a:xfrm>
+                    <a:prstGeom prst="rect">
+                      <a:avLst/>
+                    </a:prstGeom>
+                    <a:noFill/>
+                    <a:ln w="9525">
+                      <a:noFill/>
+                      <a:headEnd/>
+                      <a:tailEnd/>
+                    </a:ln>
+                  </pic:spPr>
+                </pic:pic>
+              </a:graphicData>
+            </a:graphic>
+          </wp:inline>
+        </w:drawing>
+      </w:r>
+    </w:p>
+    <w:p>
+      <w:pPr>
+        <w:pStyle w:val="ImageCaption"/>
+      </w:pPr>
+      <w:r>
+        <w:t xml:space="preserve">FIG. 2 — The apparatus: the photonic cooling layer 300 of tiles 302, pump routing 304, collector 306, and the controller 310 (sense 312 → plan 314 → drive 316). MEASURED: the rescue ladder, 1.20 → 3.50 W/mm² under the per-block planner.</w:t>
+      </w:r>
+    </w:p>
+    <w:p>
+      <w:pPr>
+        <w:pStyle w:val="CaptionedFigure"/>
+      </w:pPr>
+      <w:r>
+        <w:drawing>
+          <wp:inline>
+            <wp:extent cx="5334000" cy="3358873"/>
+            <wp:effectExtent b="0" l="0" r="0" t="0"/>
+            <wp:docPr descr="FIG. 3 — Gen 1: the execution cluster densified 2× / 4× / 8× / 16× at unchanged power, drawn from the five floorplans, with the tile pitch 302 that resolves it (500 / 200 / 100 µm). MEASURED at matched die watts (§P0.32, §P0.34)." title="" id="1" name="Picture"/>
+            <a:graphic>
+              <a:graphicData uri="http://schemas.openxmlformats.org/drawingml/2006/picture">
+                <pic:pic>
+                  <pic:nvPicPr>
+                    <pic:cNvPr descr="figures/pat_fig3.png" id="0" name="Picture"/>
+                    <pic:cNvPicPr>
+                      <a:picLocks noChangeArrowheads="1" noChangeAspect="1"/>
+                    </pic:cNvPicPr>
+                  </pic:nvPicPr>
+                  <pic:blipFill>
+                    <a:blip r:embed="rId48"/>
+                    <a:stretch>
+                      <a:fillRect/>
+                    </a:stretch>
+                  </pic:blipFill>
+                  <pic:spPr bwMode="auto">
+                    <a:xfrm>
+                      <a:off x="0" y="0"/>
+                      <a:ext cx="5334000" cy="3358873"/>
+                    </a:xfrm>
+                    <a:prstGeom prst="rect">
+                      <a:avLst/>
+                    </a:prstGeom>
+                    <a:noFill/>
+                    <a:ln w="9525">
+                      <a:noFill/>
+                      <a:headEnd/>
+                      <a:tailEnd/>
+                    </a:ln>
+                  </pic:spPr>
+                </pic:pic>
+              </a:graphicData>
+            </a:graphic>
+          </wp:inline>
+        </w:drawing>
+      </w:r>
+    </w:p>
+    <w:p>
+      <w:pPr>
+        <w:pStyle w:val="ImageCaption"/>
+      </w:pPr>
+      <w:r>
+        <w:t xml:space="preserve">FIG. 3 — Gen 1: the execution cluster densified 2× / 4× / 8× / 16× at unchanged power, drawn from the five floorplans, with the tile pitch 302 that resolves it (500 / 200 / 100 µm). MEASURED at matched die watts (§P0.32, §P0.34).</w:t>
+      </w:r>
+    </w:p>
+    <w:p>
+      <w:pPr>
+        <w:pStyle w:val="CaptionedFigure"/>
+      </w:pPr>
+      <w:r>
+        <w:drawing>
+          <wp:inline>
+            <wp:extent cx="5334000" cy="3123871"/>
+            <wp:effectExtent b="0" l="0" r="0" t="0"/>
+            <wp:docPr descr="FIG. 4 — Gen 1 in section: rails 400 widened (402) over the cluster; the target 410 chosen on an EM / TDDB lifetime budget; insets: the budget’s Arrhenius ladder and the period’s composition. MEASURED (the ladder on the card, the coupled search) on ARGUED constants (§P0.31)." title="" id="1" name="Picture"/>
+            <a:graphic>
+              <a:graphicData uri="http://schemas.openxmlformats.org/drawingml/2006/picture">
+                <pic:pic>
+                  <pic:nvPicPr>
+                    <pic:cNvPr descr="figures/pat_fig4.png" id="0" name="Picture"/>
+                    <pic:cNvPicPr>
+                      <a:picLocks noChangeArrowheads="1" noChangeAspect="1"/>
+                    </pic:cNvPicPr>
+                  </pic:nvPicPr>
+                  <pic:blipFill>
+                    <a:blip r:embed="rId49"/>
+                    <a:stretch>
+                      <a:fillRect/>
+                    </a:stretch>
+                  </pic:blipFill>
+                  <pic:spPr bwMode="auto">
+                    <a:xfrm>
+                      <a:off x="0" y="0"/>
+                      <a:ext cx="5334000" cy="3123871"/>
+                    </a:xfrm>
+                    <a:prstGeom prst="rect">
+                      <a:avLst/>
+                    </a:prstGeom>
+                    <a:noFill/>
+                    <a:ln w="9525">
+                      <a:noFill/>
+                      <a:headEnd/>
+                      <a:tailEnd/>
+                    </a:ln>
+                  </pic:spPr>
+                </pic:pic>
+              </a:graphicData>
+            </a:graphic>
+          </wp:inline>
+        </w:drawing>
+      </w:r>
+    </w:p>
+    <w:p>
+      <w:pPr>
+        <w:pStyle w:val="ImageCaption"/>
+      </w:pPr>
+      <w:r>
+        <w:t xml:space="preserve">FIG. 4 — Gen 1 in section: rails 400 widened (402) over the cluster; the target 410 chosen on an EM / TDDB lifetime budget; insets: the budget’s Arrhenius ladder and the period’s composition. MEASURED (the ladder on the card, the coupled search) on ARGUED constants (§P0.31).</w:t>
+      </w:r>
+    </w:p>
+    <w:p>
+      <w:pPr>
+        <w:pStyle w:val="CaptionedFigure"/>
+      </w:pPr>
+      <w:r>
+        <w:drawing>
+          <wp:inline>
+            <wp:extent cx="5334000" cy="2260413"/>
+            <wp:effectExtent b="0" l="0" r="0" t="0"/>
+            <wp:docPr descr="FIG. 5 — The tile against a dense unit and the film’s cold end: coarse tile → conservation; matched tile → held; matched tile at the top rung → the tile at 253 K, capped; the responses 502–508. MEASURED (§P0.32); 504–506 ARGUED." title="" id="1" name="Picture"/>
+            <a:graphic>
+              <a:graphicData uri="http://schemas.openxmlformats.org/drawingml/2006/picture">
+                <pic:pic>
+                  <pic:nvPicPr>
+                    <pic:cNvPr descr="figures/pat_fig5.png" id="0" name="Picture"/>
+                    <pic:cNvPicPr>
+                      <a:picLocks noChangeArrowheads="1" noChangeAspect="1"/>
+                    </pic:cNvPicPr>
+                  </pic:nvPicPr>
+                  <pic:blipFill>
+                    <a:blip r:embed="rId50"/>
+                    <a:stretch>
+                      <a:fillRect/>
+                    </a:stretch>
+                  </pic:blipFill>
+                  <pic:spPr bwMode="auto">
+                    <a:xfrm>
+                      <a:off x="0" y="0"/>
+                      <a:ext cx="5334000" cy="2260413"/>
+                    </a:xfrm>
+                    <a:prstGeom prst="rect">
+                      <a:avLst/>
+                    </a:prstGeom>
+                    <a:noFill/>
+                    <a:ln w="9525">
+                      <a:noFill/>
+                      <a:headEnd/>
+                      <a:tailEnd/>
+                    </a:ln>
+                  </pic:spPr>
+                </pic:pic>
+              </a:graphicData>
+            </a:graphic>
+          </wp:inline>
+        </w:drawing>
+      </w:r>
+    </w:p>
+    <w:p>
+      <w:pPr>
+        <w:pStyle w:val="ImageCaption"/>
+      </w:pPr>
+      <w:r>
+        <w:t xml:space="preserve">FIG. 5 — The tile against a dense unit and the film’s cold end: coarse tile → conservation; matched tile → held; matched tile at the top rung → the tile at 253 K, capped; the responses 502–508. MEASURED (§P0.32); 504–506 ARGUED.</w:t>
+      </w:r>
+    </w:p>
+    <w:p>
+      <w:pPr>
+        <w:pStyle w:val="CaptionedFigure"/>
+      </w:pPr>
+      <w:r>
+        <w:drawing>
+          <wp:inline>
+            <wp:extent cx="5334000" cy="2043055"/>
+            <wp:effectExtent b="0" l="0" r="0" t="0"/>
+            <wp:docPr descr="FIG. 6 — Gen 3: the storage die 610 on the sink side (MEASURED, falsified, X4); the two-sided stack 610–620 and the 2.5D placement 630–632 (ARGUED)." title="" id="1" name="Picture"/>
+            <a:graphic>
+              <a:graphicData uri="http://schemas.openxmlformats.org/drawingml/2006/picture">
+                <pic:pic>
+                  <pic:nvPicPr>
+                    <pic:cNvPr descr="figures/pat_fig6.png" id="0" name="Picture"/>
+                    <pic:cNvPicPr>
+                      <a:picLocks noChangeArrowheads="1" noChangeAspect="1"/>
+                    </pic:cNvPicPr>
+                  </pic:nvPicPr>
+                  <pic:blipFill>
+                    <a:blip r:embed="rId51"/>
+                    <a:stretch>
+                      <a:fillRect/>
+                    </a:stretch>
+                  </pic:blipFill>
+                  <pic:spPr bwMode="auto">
+                    <a:xfrm>
+                      <a:off x="0" y="0"/>
+                      <a:ext cx="5334000" cy="2043055"/>
+                    </a:xfrm>
+                    <a:prstGeom prst="rect">
+                      <a:avLst/>
+                    </a:prstGeom>
+                    <a:noFill/>
+                    <a:ln w="9525">
+                      <a:noFill/>
+                      <a:headEnd/>
+                      <a:tailEnd/>
+                    </a:ln>
+                  </pic:spPr>
+                </pic:pic>
+              </a:graphicData>
+            </a:graphic>
+          </wp:inline>
+        </w:drawing>
+      </w:r>
+    </w:p>
+    <w:p>
+      <w:pPr>
+        <w:pStyle w:val="ImageCaption"/>
+      </w:pPr>
+      <w:r>
+        <w:t xml:space="preserve">FIG. 6 — Gen 3: the storage die 610 on the sink side (MEASURED, falsified, X4); the two-sided stack 610–620 and the 2.5D placement 630–632 (ARGUED).</w:t>
+      </w:r>
+    </w:p>
+    <w:p>
+      <w:pPr>
+        <w:pStyle w:val="CaptionedFigure"/>
+      </w:pPr>
+      <w:r>
+        <w:drawing>
+          <wp:inline>
+            <wp:extent cx="5334000" cy="3056112"/>
+            <wp:effectExtent b="0" l="0" r="0" t="0"/>
+            <wp:docPr descr="FIG. 7 — The evolved core 100′ composed: dense cluster 110′ under matched tiles 302, rails 402, target 410, low-V_t cells 700 (ARGUED), storage die 610 off the heat path (ARGUED); section B–B′." title="" id="1" name="Picture"/>
+            <a:graphic>
+              <a:graphicData uri="http://schemas.openxmlformats.org/drawingml/2006/picture">
+                <pic:pic>
+                  <pic:nvPicPr>
+                    <pic:cNvPr descr="figures/pat_fig7.png" id="0" name="Picture"/>
+                    <pic:cNvPicPr>
+                      <a:picLocks noChangeArrowheads="1" noChangeAspect="1"/>
+                    </pic:cNvPicPr>
+                  </pic:nvPicPr>
+                  <pic:blipFill>
+                    <a:blip r:embed="rId52"/>
+                    <a:stretch>
+                      <a:fillRect/>
+                    </a:stretch>
+                  </pic:blipFill>
+                  <pic:spPr bwMode="auto">
+                    <a:xfrm>
+                      <a:off x="0" y="0"/>
+                      <a:ext cx="5334000" cy="3056112"/>
+                    </a:xfrm>
+                    <a:prstGeom prst="rect">
+                      <a:avLst/>
+                    </a:prstGeom>
+                    <a:noFill/>
+                    <a:ln w="9525">
+                      <a:noFill/>
+                      <a:headEnd/>
+                      <a:tailEnd/>
+                    </a:ln>
+                  </pic:spPr>
+                </pic:pic>
+              </a:graphicData>
+            </a:graphic>
+          </wp:inline>
+        </w:drawing>
+      </w:r>
+    </w:p>
+    <w:p>
+      <w:pPr>
+        <w:pStyle w:val="ImageCaption"/>
+      </w:pPr>
+      <w:r>
+        <w:t xml:space="preserve">FIG. 7 — The evolved core 100′ composed: dense cluster 110′ under matched tiles 302, rails 402, target 410, low-V_t cells 700 (ARGUED), storage die 610 off the heat path (ARGUED); section B–B′.</w:t>
+      </w:r>
+    </w:p>
+    <w:p>
+      <w:pPr>
+        <w:pStyle w:val="CaptionedFigure"/>
+      </w:pPr>
+      <w:r>
+        <w:drawing>
+          <wp:inline>
+            <wp:extent cx="5334000" cy="3217446"/>
+            <wp:effectExtent b="0" l="0" r="0" t="0"/>
+            <wp:docPr descr="FIG. 8 — The ladder: one architectural change per measured constraint, solid = MEASURED, dashed = ARGUED." title="" id="1" name="Picture"/>
+            <a:graphic>
+              <a:graphicData uri="http://schemas.openxmlformats.org/drawingml/2006/picture">
+                <pic:pic>
+                  <pic:nvPicPr>
+                    <pic:cNvPr descr="figures/pat_fig8.png" id="0" name="Picture"/>
+                    <pic:cNvPicPr>
+                      <a:picLocks noChangeArrowheads="1" noChangeAspect="1"/>
+                    </pic:cNvPicPr>
+                  </pic:nvPicPr>
+                  <pic:blipFill>
+                    <a:blip r:embed="rId53"/>
+                    <a:stretch>
+                      <a:fillRect/>
+                    </a:stretch>
+                  </pic:blipFill>
+                  <pic:spPr bwMode="auto">
+                    <a:xfrm>
+                      <a:off x="0" y="0"/>
+                      <a:ext cx="5334000" cy="3217446"/>
+                    </a:xfrm>
+                    <a:prstGeom prst="rect">
+                      <a:avLst/>
+                    </a:prstGeom>
+                    <a:noFill/>
+                    <a:ln w="9525">
+                      <a:noFill/>
+                      <a:headEnd/>
+                      <a:tailEnd/>
+                    </a:ln>
+                  </pic:spPr>
+                </pic:pic>
+              </a:graphicData>
+            </a:graphic>
+          </wp:inline>
+        </w:drawing>
+      </w:r>
+    </w:p>
+    <w:p>
+      <w:pPr>
+        <w:pStyle w:val="ImageCaption"/>
+      </w:pPr>
+      <w:r>
+        <w:t xml:space="preserve">FIG. 8 — The ladder: one architectural change per measured constraint, solid = MEASURED, dashed = ARGUED.</w:t>
+      </w:r>
+    </w:p>
+    <w:p>
+      <w:pPr>
+        <w:pStyle w:val="BodyText"/>
+      </w:pPr>
+      <w:r>
+        <w:rPr>
+          <w:b/>
+        </w:rPr>
+        <w:t xml:space="preserve">Reference numerals.</w:t>
+      </w:r>
+    </w:p>
+    <w:tbl>
+      <w:tblPr>
+        <w:tblStyle w:val="Table"/>
+        <w:tblW w:type="pct" w:w="5000.0"/>
+        <w:tblLook w:firstRow="1"/>
+      </w:tblPr>
+      <w:tblGrid>
+        <w:gridCol w:w="2640"/>
+        <w:gridCol w:w="2640"/>
+        <w:gridCol w:w="2640"/>
+      </w:tblGrid>
+      <w:tr>
+        <w:trPr>
+          <w:cnfStyle w:firstRow="1"/>
+        </w:trPr>
+        <w:tc>
+          <w:tcPr>
+            <w:tcBorders>
+              <w:bottom w:val="single"/>
+            </w:tcBorders>
+            <w:vAlign w:val="bottom"/>
+          </w:tcPr>
+          <w:p>
+            <w:pPr>
+              <w:pStyle w:val="Compact"/>
+              <w:jc w:val="left"/>
+            </w:pPr>
+            <w:r>
+              <w:t xml:space="preserve">numeral</w:t>
+            </w:r>
+          </w:p>
+        </w:tc>
+        <w:tc>
+          <w:tcPr>
+            <w:tcBorders>
+              <w:bottom w:val="single"/>
+            </w:tcBorders>
+            <w:vAlign w:val="bottom"/>
+          </w:tcPr>
+          <w:p>
+            <w:pPr>
+              <w:pStyle w:val="Compact"/>
+              <w:jc w:val="left"/>
+            </w:pPr>
+            <w:r>
+              <w:t xml:space="preserve">element</w:t>
+            </w:r>
+          </w:p>
+        </w:tc>
+        <w:tc>
+          <w:tcPr>
+            <w:tcBorders>
+              <w:bottom w:val="single"/>
+            </w:tcBorders>
+            <w:vAlign w:val="bottom"/>
+          </w:tcPr>
+          <w:p>
+            <w:pPr>
+              <w:pStyle w:val="Compact"/>
+              <w:jc w:val="left"/>
+            </w:pPr>
+            <w:r>
+              <w:t xml:space="preserve">first figure</w:t>
+            </w:r>
+          </w:p>
+        </w:tc>
+      </w:tr>
+      <w:tr>
+        <w:tc>
+          <w:p>
+            <w:pPr>
+              <w:pStyle w:val="Compact"/>
+              <w:jc w:val="left"/>
+            </w:pPr>
+            <w:r>
+              <w:t xml:space="preserve">100</w:t>
+            </w:r>
+          </w:p>
+        </w:tc>
+        <w:tc>
+          <w:p>
+            <w:pPr>
+              <w:pStyle w:val="Compact"/>
+              <w:jc w:val="left"/>
+            </w:pPr>
+            <w:r>
+              <w:t xml:space="preserve">core as traced (gen 0)</w:t>
+            </w:r>
+          </w:p>
+        </w:tc>
+        <w:tc>
+          <w:p>
+            <w:pPr>
+              <w:pStyle w:val="Compact"/>
+              <w:jc w:val="left"/>
+            </w:pPr>
+            <w:r>
+              <w:t xml:space="preserve">FIG. 1</w:t>
+            </w:r>
+          </w:p>
+        </w:tc>
+      </w:tr>
+      <w:tr>
+        <w:tc>
+          <w:p>
+            <w:pPr>
+              <w:pStyle w:val="Compact"/>
+              <w:jc w:val="left"/>
+            </w:pPr>
+            <w:r>
+              <w:t xml:space="preserve">110</w:t>
+            </w:r>
+          </w:p>
+        </w:tc>
+        <w:tc>
+          <w:p>
+            <w:pPr>
+              <w:pStyle w:val="Compact"/>
+              <w:jc w:val="left"/>
+            </w:pPr>
+            <w:r>
+              <w:t xml:space="preserve">execution cluster</w:t>
+            </w:r>
+          </w:p>
+        </w:tc>
+        <w:tc>
+          <w:p>
+            <w:pPr>
+              <w:pStyle w:val="Compact"/>
+              <w:jc w:val="left"/>
+            </w:pPr>
+            <w:r>
+              <w:t xml:space="preserve">FIG. 1</w:t>
+            </w:r>
+          </w:p>
+        </w:tc>
+      </w:tr>
+      <w:tr>
+        <w:tc>
+          <w:p>
+            <w:pPr>
+              <w:pStyle w:val="Compact"/>
+              <w:jc w:val="left"/>
+            </w:pPr>
+            <w:r>
+              <w:t xml:space="preserve">112</w:t>
+            </w:r>
+          </w:p>
+        </w:tc>
+        <w:tc>
+          <w:p>
+            <w:pPr>
+              <w:pStyle w:val="Compact"/>
+              <w:jc w:val="left"/>
+            </w:pPr>
+            <w:r>
+              <w:t xml:space="preserve">complex ALU (the worst block)</w:t>
+            </w:r>
+          </w:p>
+        </w:tc>
+        <w:tc>
+          <w:p>
+            <w:pPr>
+              <w:pStyle w:val="Compact"/>
+              <w:jc w:val="left"/>
+            </w:pPr>
+            <w:r>
+              <w:t xml:space="preserve">FIG. 1</w:t>
+            </w:r>
+          </w:p>
+        </w:tc>
+      </w:tr>
+      <w:tr>
+        <w:tc>
+          <w:p>
+            <w:pPr>
+              <w:pStyle w:val="Compact"/>
+              <w:jc w:val="left"/>
+            </w:pPr>
+            <w:r>
+              <w:t xml:space="preserve">114</w:t>
+            </w:r>
+          </w:p>
+        </w:tc>
+        <w:tc>
+          <w:p>
+            <w:pPr>
+              <w:pStyle w:val="Compact"/>
+              <w:jc w:val="left"/>
+            </w:pPr>
+            <w:r>
+              <w:t xml:space="preserve">integer ALU</w:t>
+            </w:r>
+          </w:p>
+        </w:tc>
+        <w:tc>
+          <w:p>
+            <w:pPr>
+              <w:pStyle w:val="Compact"/>
+              <w:jc w:val="left"/>
+            </w:pPr>
+            <w:r>
+              <w:t xml:space="preserve">FIG. 1</w:t>
+            </w:r>
+          </w:p>
+        </w:tc>
+      </w:tr>
+      <w:tr>
+        <w:tc>
+          <w:p>
+            <w:pPr>
+              <w:pStyle w:val="Compact"/>
+              <w:jc w:val="left"/>
+            </w:pPr>
+            <w:r>
+              <w:t xml:space="preserve">116</w:t>
+            </w:r>
+          </w:p>
+        </w:tc>
+        <w:tc>
+          <w:p>
+            <w:pPr>
+              <w:pStyle w:val="Compact"/>
+              <w:jc w:val="left"/>
+            </w:pPr>
+            <w:r>
+              <w:t xml:space="preserve">floating-point units</w:t>
+            </w:r>
+          </w:p>
+        </w:tc>
+        <w:tc>
+          <w:p>
+            <w:pPr>
+              <w:pStyle w:val="Compact"/>
+              <w:jc w:val="left"/>
+            </w:pPr>
+            <w:r>
+              <w:t xml:space="preserve">FIG. 1</w:t>
+            </w:r>
+          </w:p>
+        </w:tc>
+      </w:tr>
+      <w:tr>
+        <w:tc>
+          <w:p>
+            <w:pPr>
+              <w:pStyle w:val="Compact"/>
+              <w:jc w:val="left"/>
+            </w:pPr>
+            <w:r>
+              <w:t xml:space="preserve">118</w:t>
+            </w:r>
+          </w:p>
+        </w:tc>
+        <w:tc>
+          <w:p>
+            <w:pPr>
+              <w:pStyle w:val="Compact"/>
+              <w:jc w:val="left"/>
+            </w:pPr>
+            <w:r>
+              <w:t xml:space="preserve">vector (AVX) units</w:t>
+            </w:r>
+          </w:p>
+        </w:tc>
+        <w:tc>
+          <w:p>
+            <w:pPr>
+              <w:pStyle w:val="Compact"/>
+              <w:jc w:val="left"/>
+            </w:pPr>
+            <w:r>
+              <w:t xml:space="preserve">FIG. 1</w:t>
+            </w:r>
+          </w:p>
+        </w:tc>
+      </w:tr>
+      <w:tr>
+        <w:tc>
+          <w:p>
+            <w:pPr>
+              <w:pStyle w:val="Compact"/>
+              <w:jc w:val="left"/>
+            </w:pPr>
+            <w:r>
+              <w:t xml:space="preserve">120</w:t>
+            </w:r>
+          </w:p>
+        </w:tc>
+        <w:tc>
+          <w:p>
+            <w:pPr>
+              <w:pStyle w:val="Compact"/>
+              <w:jc w:val="left"/>
+            </w:pPr>
+            <w:r>
+              <w:t xml:space="preserve">L2 cache</w:t>
+            </w:r>
+          </w:p>
+        </w:tc>
+        <w:tc>
+          <w:p>
+            <w:pPr>
+              <w:pStyle w:val="Compact"/>
+              <w:jc w:val="left"/>
+            </w:pPr>
+            <w:r>
+              <w:t xml:space="preserve">FIG. 1</w:t>
+            </w:r>
+          </w:p>
+        </w:tc>
+      </w:tr>
+      <w:tr>
+        <w:tc>
+          <w:p>
+            <w:pPr>
+              <w:pStyle w:val="Compact"/>
+              <w:jc w:val="left"/>
+            </w:pPr>
+            <w:r>
+              <w:t xml:space="preserve">122</w:t>
+            </w:r>
+          </w:p>
+        </w:tc>
+        <w:tc>
+          <w:p>
+            <w:pPr>
+              <w:pStyle w:val="Compact"/>
+              <w:jc w:val="left"/>
+            </w:pPr>
+            <w:r>
+              <w:t xml:space="preserve">L3 slice</w:t>
+            </w:r>
+          </w:p>
+        </w:tc>
+        <w:tc>
+          <w:p>
+            <w:pPr>
+              <w:pStyle w:val="Compact"/>
+              <w:jc w:val="left"/>
+            </w:pPr>
+            <w:r>
+              <w:t xml:space="preserve">FIG. 1</w:t>
+            </w:r>
+          </w:p>
+        </w:tc>
+      </w:tr>
+      <w:tr>
+        <w:tc>
+          <w:p>
+            <w:pPr>
+              <w:pStyle w:val="Compact"/>
+              <w:jc w:val="left"/>
+            </w:pPr>
+            <w:r>
+              <w:t xml:space="preserve">124</w:t>
+            </w:r>
+          </w:p>
+        </w:tc>
+        <w:tc>
+          <w:p>
+            <w:pPr>
+              <w:pStyle w:val="Compact"/>
+              <w:jc w:val="left"/>
+            </w:pPr>
+            <w:r>
+              <w:t xml:space="preserve">data cache</w:t>
+            </w:r>
+          </w:p>
+        </w:tc>
+        <w:tc>
+          <w:p>
+            <w:pPr>
+              <w:pStyle w:val="Compact"/>
+              <w:jc w:val="left"/>
+            </w:pPr>
+            <w:r>
+              <w:t xml:space="preserve">FIG. 1</w:t>
+            </w:r>
+          </w:p>
+        </w:tc>
+      </w:tr>
+      <w:tr>
+        <w:tc>
+          <w:p>
+            <w:pPr>
+              <w:pStyle w:val="Compact"/>
+              <w:jc w:val="left"/>
+            </w:pPr>
+            <w:r>
+              <w:t xml:space="preserve">126</w:t>
+            </w:r>
+          </w:p>
+        </w:tc>
+        <w:tc>
+          <w:p>
+            <w:pPr>
+              <w:pStyle w:val="Compact"/>
+              <w:jc w:val="left"/>
+            </w:pPr>
+            <w:r>
+              <w:t xml:space="preserve">instruction cache</w:t>
+            </w:r>
+          </w:p>
+        </w:tc>
+        <w:tc>
+          <w:p>
+            <w:pPr>
+              <w:pStyle w:val="Compact"/>
+              <w:jc w:val="left"/>
+            </w:pPr>
+            <w:r>
+              <w:t xml:space="preserve">FIG. 1</w:t>
+            </w:r>
+          </w:p>
+        </w:tc>
+      </w:tr>
+      <w:tr>
+        <w:tc>
+          <w:p>
+            <w:pPr>
+              <w:pStyle w:val="Compact"/>
+              <w:jc w:val="left"/>
+            </w:pPr>
+            <w:r>
+              <w:t xml:space="preserve">130</w:t>
+            </w:r>
+          </w:p>
+        </w:tc>
+        <w:tc>
+          <w:p>
+            <w:pPr>
+              <w:pStyle w:val="Compact"/>
+              <w:jc w:val="left"/>
+            </w:pPr>
+            <w:r>
+              <w:t xml:space="preserve">front end / scheduler</w:t>
+            </w:r>
+          </w:p>
+        </w:tc>
+        <w:tc>
+          <w:p>
+            <w:pPr>
+              <w:pStyle w:val="Compact"/>
+              <w:jc w:val="left"/>
+            </w:pPr>
+            <w:r>
+              <w:t xml:space="preserve">FIG. 1</w:t>
+            </w:r>
+          </w:p>
+        </w:tc>
+      </w:tr>
+      <w:tr>
+        <w:tc>
+          <w:p>
+            <w:pPr>
+              <w:pStyle w:val="Compact"/>
+              <w:jc w:val="left"/>
+            </w:pPr>
+            <w:r>
+              <w:t xml:space="preserve">140</w:t>
+            </w:r>
+          </w:p>
+        </w:tc>
+        <w:tc>
+          <w:p>
+            <w:pPr>
+              <w:pStyle w:val="Compact"/>
+              <w:jc w:val="left"/>
+            </w:pPr>
+            <w:r>
+              <w:t xml:space="preserve">control slab</w:t>
+            </w:r>
+          </w:p>
+        </w:tc>
+        <w:tc>
+          <w:p>
+            <w:pPr>
+              <w:pStyle w:val="Compact"/>
+              <w:jc w:val="left"/>
+            </w:pPr>
+            <w:r>
+              <w:t xml:space="preserve">FIG. 1</w:t>
+            </w:r>
+          </w:p>
+        </w:tc>
+      </w:tr>
+      <w:tr>
+        <w:tc>
+          <w:p>
+            <w:pPr>
+              <w:pStyle w:val="Compact"/>
+              <w:jc w:val="left"/>
+            </w:pPr>
+            <w:r>
+              <w:t xml:space="preserve">200</w:t>
+            </w:r>
+          </w:p>
+        </w:tc>
+        <w:tc>
+          <w:p>
+            <w:pPr>
+              <w:pStyle w:val="Compact"/>
+              <w:jc w:val="left"/>
+            </w:pPr>
+            <w:r>
+              <w:t xml:space="preserve">substrate and bumps</w:t>
+            </w:r>
+          </w:p>
+        </w:tc>
+        <w:tc>
+          <w:p>
+            <w:pPr>
+              <w:pStyle w:val="Compact"/>
+              <w:jc w:val="left"/>
+            </w:pPr>
+            <w:r>
+              <w:t xml:space="preserve">FIG. 1</w:t>
+            </w:r>
+          </w:p>
+        </w:tc>
+      </w:tr>
+      <w:tr>
+        <w:tc>
+          <w:p>
+            <w:pPr>
+              <w:pStyle w:val="Compact"/>
+              <w:jc w:val="left"/>
+            </w:pPr>
+            <w:r>
+              <w:t xml:space="preserve">202</w:t>
+            </w:r>
+          </w:p>
+        </w:tc>
+        <w:tc>
+          <w:p>
+            <w:pPr>
+              <w:pStyle w:val="Compact"/>
+              <w:jc w:val="left"/>
+            </w:pPr>
+            <w:r>
+              <w:t xml:space="preserve">active layer</w:t>
+            </w:r>
+          </w:p>
+        </w:tc>
+        <w:tc>
+          <w:p>
+            <w:pPr>
+              <w:pStyle w:val="Compact"/>
+              <w:jc w:val="left"/>
+            </w:pPr>
+            <w:r>
+              <w:t xml:space="preserve">FIG. 1</w:t>
+            </w:r>
+          </w:p>
+        </w:tc>
+      </w:tr>
+      <w:tr>
+        <w:tc>
+          <w:p>
+            <w:pPr>
+              <w:pStyle w:val="Compact"/>
+              <w:jc w:val="left"/>
+            </w:pPr>
+            <w:r>
+              <w:t xml:space="preserve">204</w:t>
+            </w:r>
+          </w:p>
+        </w:tc>
+        <w:tc>
+          <w:p>
+            <w:pPr>
+              <w:pStyle w:val="Compact"/>
+              <w:jc w:val="left"/>
+            </w:pPr>
+            <w:r>
+              <w:t xml:space="preserve">silicon above the transistors (burial depth)</w:t>
+            </w:r>
+          </w:p>
+        </w:tc>
+        <w:tc>
+          <w:p>
+            <w:pPr>
+              <w:pStyle w:val="Compact"/>
+              <w:jc w:val="left"/>
+            </w:pPr>
+            <w:r>
+              <w:t xml:space="preserve">FIG. 1</w:t>
+            </w:r>
+          </w:p>
+        </w:tc>
+      </w:tr>
+      <w:tr>
+        <w:tc>
+          <w:p>
+            <w:pPr>
+              <w:pStyle w:val="Compact"/>
+              <w:jc w:val="left"/>
+            </w:pPr>
+            <w:r>
+              <w:t xml:space="preserve">206</w:t>
+            </w:r>
+          </w:p>
+        </w:tc>
+        <w:tc>
+          <w:p>
+            <w:pPr>
+              <w:pStyle w:val="Compact"/>
+              <w:jc w:val="left"/>
+            </w:pPr>
+            <w:r>
+              <w:t xml:space="preserve">thermal interface material</w:t>
+            </w:r>
+          </w:p>
+        </w:tc>
+        <w:tc>
+          <w:p>
+            <w:pPr>
+              <w:pStyle w:val="Compact"/>
+              <w:jc w:val="left"/>
+            </w:pPr>
+            <w:r>
+              <w:t xml:space="preserve">FIG. 1</w:t>
+            </w:r>
+          </w:p>
+        </w:tc>
+      </w:tr>
+      <w:tr>
+        <w:tc>
+          <w:p>
+            <w:pPr>
+              <w:pStyle w:val="Compact"/>
+              <w:jc w:val="left"/>
+            </w:pPr>
+            <w:r>
+              <w:t xml:space="preserve">208</w:t>
+            </w:r>
+          </w:p>
+        </w:tc>
+        <w:tc>
+          <w:p>
+            <w:pPr>
+              <w:pStyle w:val="Compact"/>
+              <w:jc w:val="left"/>
+            </w:pPr>
+            <w:r>
+              <w:t xml:space="preserve">cold plate</w:t>
+            </w:r>
+          </w:p>
+        </w:tc>
+        <w:tc>
+          <w:p>
+            <w:pPr>
+              <w:pStyle w:val="Compact"/>
+              <w:jc w:val="left"/>
+            </w:pPr>
+            <w:r>
+              <w:t xml:space="preserve">FIG. 1</w:t>
+            </w:r>
+          </w:p>
+        </w:tc>
+      </w:tr>
+      <w:tr>
+        <w:tc>
+          <w:p>
+            <w:pPr>
+              <w:pStyle w:val="Compact"/>
+              <w:jc w:val="left"/>
+            </w:pPr>
+            <w:r>
+              <w:t xml:space="preserve">210</w:t>
+            </w:r>
+          </w:p>
+        </w:tc>
+        <w:tc>
+          <w:p>
+            <w:pPr>
+              <w:pStyle w:val="Compact"/>
+              <w:jc w:val="left"/>
+            </w:pPr>
+            <w:r>
+              <w:t xml:space="preserve">fin stack and fan</w:t>
+            </w:r>
+          </w:p>
+        </w:tc>
+        <w:tc>
+          <w:p>
+            <w:pPr>
+              <w:pStyle w:val="Compact"/>
+              <w:jc w:val="left"/>
+            </w:pPr>
+            <w:r>
+              <w:t xml:space="preserve">FIG. 1</w:t>
+            </w:r>
+          </w:p>
+        </w:tc>
+      </w:tr>
+      <w:tr>
+        <w:tc>
+          <w:p>
+            <w:pPr>
+              <w:pStyle w:val="Compact"/>
+              <w:jc w:val="left"/>
+            </w:pPr>
+            <w:r>
+              <w:t xml:space="preserve">300</w:t>
+            </w:r>
+          </w:p>
+        </w:tc>
+        <w:tc>
+          <w:p>
+            <w:pPr>
+              <w:pStyle w:val="Compact"/>
+              <w:jc w:val="left"/>
+            </w:pPr>
+            <w:r>
+              <w:t xml:space="preserve">photonic cooling layer (tile array)</w:t>
+            </w:r>
+          </w:p>
+        </w:tc>
+        <w:tc>
+          <w:p>
+            <w:pPr>
+              <w:pStyle w:val="Compact"/>
+              <w:jc w:val="left"/>
+            </w:pPr>
+            <w:r>
+              <w:t xml:space="preserve">FIG. 2</w:t>
+            </w:r>
+          </w:p>
+        </w:tc>
+      </w:tr>
+      <w:tr>
+        <w:tc>
+          <w:p>
+            <w:pPr>
+              <w:pStyle w:val="Compact"/>
+              <w:jc w:val="left"/>
+            </w:pPr>
+            <w:r>
+              <w:t xml:space="preserve">302</w:t>
+            </w:r>
+          </w:p>
+        </w:tc>
+        <w:tc>
+          <w:p>
+            <w:pPr>
+              <w:pStyle w:val="Compact"/>
+              <w:jc w:val="left"/>
+            </w:pPr>
+            <w:r>
+              <w:t xml:space="preserve">anti-Stokes tile (GaAs or SiN-encapsulated dye, 30 µm)</w:t>
+            </w:r>
+          </w:p>
+        </w:tc>
+        <w:tc>
+          <w:p>
+            <w:pPr>
+              <w:pStyle w:val="Compact"/>
+              <w:jc w:val="left"/>
+            </w:pPr>
+            <w:r>
+              <w:t xml:space="preserve">FIG. 2</w:t>
+            </w:r>
+          </w:p>
+        </w:tc>
+      </w:tr>
+      <w:tr>
+        <w:tc>
+          <w:p>
+            <w:pPr>
+              <w:pStyle w:val="Compact"/>
+              <w:jc w:val="left"/>
+            </w:pPr>
+            <w:r>
+              <w:t xml:space="preserve">304</w:t>
+            </w:r>
+          </w:p>
+        </w:tc>
+        <w:tc>
+          <w:p>
+            <w:pPr>
+              <w:pStyle w:val="Compact"/>
+              <w:jc w:val="left"/>
+            </w:pPr>
+            <w:r>
+              <w:t xml:space="preserve">pump waveguides and couplers</w:t>
+            </w:r>
+          </w:p>
+        </w:tc>
+        <w:tc>
+          <w:p>
+            <w:pPr>
+              <w:pStyle w:val="Compact"/>
+              <w:jc w:val="left"/>
+            </w:pPr>
+            <w:r>
+              <w:t xml:space="preserve">FIG. 2</w:t>
+            </w:r>
+          </w:p>
+        </w:tc>
+      </w:tr>
+      <w:tr>
+        <w:tc>
+          <w:p>
+            <w:pPr>
+              <w:pStyle w:val="Compact"/>
+              <w:jc w:val="left"/>
+            </w:pPr>
+            <w:r>
+              <w:t xml:space="preserve">306</w:t>
+            </w:r>
+          </w:p>
+        </w:tc>
+        <w:tc>
+          <w:p>
+            <w:pPr>
+              <w:pStyle w:val="Compact"/>
+              <w:jc w:val="left"/>
+            </w:pPr>
+            <w:r>
+              <w:t xml:space="preserve">luminescence collector</w:t>
+            </w:r>
+          </w:p>
+        </w:tc>
+        <w:tc>
+          <w:p>
+            <w:pPr>
+              <w:pStyle w:val="Compact"/>
+              <w:jc w:val="left"/>
+            </w:pPr>
+            <w:r>
+              <w:t xml:space="preserve">FIG. 2</w:t>
+            </w:r>
+          </w:p>
+        </w:tc>
+      </w:tr>
+      <w:tr>
+        <w:tc>
+          <w:p>
+            <w:pPr>
+              <w:pStyle w:val="Compact"/>
+              <w:jc w:val="left"/>
+            </w:pPr>
+            <w:r>
+              <w:t xml:space="preserve">310</w:t>
+            </w:r>
+          </w:p>
+        </w:tc>
+        <w:tc>
+          <w:p>
+            <w:pPr>
+              <w:pStyle w:val="Compact"/>
+              <w:jc w:val="left"/>
+            </w:pPr>
+            <w:r>
+              <w:t xml:space="preserve">controller</w:t>
+            </w:r>
+          </w:p>
+        </w:tc>
+        <w:tc>
+          <w:p>
+            <w:pPr>
+              <w:pStyle w:val="Compact"/>
+              <w:jc w:val="left"/>
+            </w:pPr>
+            <w:r>
+              <w:t xml:space="preserve">FIG. 2</w:t>
+            </w:r>
+          </w:p>
+        </w:tc>
+      </w:tr>
+      <w:tr>
+        <w:tc>
+          <w:p>
+            <w:pPr>
+              <w:pStyle w:val="Compact"/>
+              <w:jc w:val="left"/>
+            </w:pPr>
+            <w:r>
+              <w:t xml:space="preserve">312</w:t>
+            </w:r>
+          </w:p>
+        </w:tc>
+        <w:tc>
+          <w:p>
+            <w:pPr>
+              <w:pStyle w:val="Compact"/>
+              <w:jc w:val="left"/>
+            </w:pPr>
+            <w:r>
+              <w:t xml:space="preserve">sensing: per-tile temperature</w:t>
+            </w:r>
+          </w:p>
+        </w:tc>
+        <w:tc>
+          <w:p>
+            <w:pPr>
+              <w:pStyle w:val="Compact"/>
+              <w:jc w:val="left"/>
+            </w:pPr>
+            <w:r>
+              <w:t xml:space="preserve">FIG. 2</w:t>
+            </w:r>
+          </w:p>
+        </w:tc>
+      </w:tr>
+      <w:tr>
+        <w:tc>
+          <w:p>
+            <w:pPr>
+              <w:pStyle w:val="Compact"/>
+              <w:jc w:val="left"/>
+            </w:pPr>
+            <w:r>
+              <w:t xml:space="preserve">314</w:t>
+            </w:r>
+          </w:p>
+        </w:tc>
+        <w:tc>
+          <w:p>
+            <w:pPr>
+              <w:pStyle w:val="Compact"/>
+              <w:jc w:val="left"/>
+            </w:pPr>
+            <w:r>
+              <w:t xml:space="preserve">planner: minimum plan on the cool branch under the conservation cap</w:t>
+            </w:r>
+          </w:p>
+        </w:tc>
+        <w:tc>
+          <w:p>
+            <w:pPr>
+              <w:pStyle w:val="Compact"/>
+              <w:jc w:val="left"/>
+            </w:pPr>
+            <w:r>
+              <w:t xml:space="preserve">FIG. 2</w:t>
+            </w:r>
+          </w:p>
+        </w:tc>
+      </w:tr>
+      <w:tr>
+        <w:tc>
+          <w:p>
+            <w:pPr>
+              <w:pStyle w:val="Compact"/>
+              <w:jc w:val="left"/>
+            </w:pPr>
+            <w:r>
+              <w:t xml:space="preserve">316</w:t>
+            </w:r>
+          </w:p>
+        </w:tc>
+        <w:tc>
+          <w:p>
+            <w:pPr>
+              <w:pStyle w:val="Compact"/>
+              <w:jc w:val="left"/>
+            </w:pPr>
+            <w:r>
+              <w:t xml:space="preserve">per-tile pump drive</w:t>
+            </w:r>
+          </w:p>
+        </w:tc>
+        <w:tc>
+          <w:p>
+            <w:pPr>
+              <w:pStyle w:val="Compact"/>
+              <w:jc w:val="left"/>
+            </w:pPr>
+            <w:r>
+              <w:t xml:space="preserve">FIG. 2</w:t>
+            </w:r>
+          </w:p>
+        </w:tc>
+      </w:tr>
+      <w:tr>
+        <w:tc>
+          <w:p>
+            <w:pPr>
+              <w:pStyle w:val="Compact"/>
+              <w:jc w:val="left"/>
+            </w:pPr>
+            <w:r>
+              <w:t xml:space="preserve">110′ … 110″″</w:t>
+            </w:r>
+          </w:p>
+        </w:tc>
+        <w:tc>
+          <w:p>
+            <w:pPr>
+              <w:pStyle w:val="Compact"/>
+              <w:jc w:val="left"/>
+            </w:pPr>
+            <w:r>
+              <w:t xml:space="preserve">the execution cluster at 2×, 4×, 8×, 16× density</w:t>
+            </w:r>
+          </w:p>
+        </w:tc>
+        <w:tc>
+          <w:p>
+            <w:pPr>
+              <w:pStyle w:val="Compact"/>
+              <w:jc w:val="left"/>
+            </w:pPr>
+            <w:r>
+              <w:t xml:space="preserve">FIG. 3</w:t>
+            </w:r>
+          </w:p>
+        </w:tc>
+      </w:tr>
+      <w:tr>
+        <w:tc>
+          <w:p>
+            <w:pPr>
+              <w:pStyle w:val="Compact"/>
+              <w:jc w:val="left"/>
+            </w:pPr>
+            <w:r>
+              <w:t xml:space="preserve">400</w:t>
+            </w:r>
+          </w:p>
+        </w:tc>
+        <w:tc>
+          <w:p>
+            <w:pPr>
+              <w:pStyle w:val="Compact"/>
+              <w:jc w:val="left"/>
+            </w:pPr>
+            <w:r>
+              <w:t xml:space="preserve">power-distribution stripes (top metal)</w:t>
+            </w:r>
+          </w:p>
+        </w:tc>
+        <w:tc>
+          <w:p>
+            <w:pPr>
+              <w:pStyle w:val="Compact"/>
+              <w:jc w:val="left"/>
+            </w:pPr>
+            <w:r>
+              <w:t xml:space="preserve">FIG. 4</w:t>
+            </w:r>
+          </w:p>
+        </w:tc>
+      </w:tr>
+      <w:tr>
+        <w:tc>
+          <w:p>
+            <w:pPr>
+              <w:pStyle w:val="Compact"/>
+              <w:jc w:val="left"/>
+            </w:pPr>
+            <w:r>
+              <w:t xml:space="preserve">402</w:t>
+            </w:r>
+          </w:p>
+        </w:tc>
+        <w:tc>
+          <w:p>
+            <w:pPr>
+              <w:pStyle w:val="Compact"/>
+              <w:jc w:val="left"/>
+            </w:pPr>
+            <w:r>
+              <w:t xml:space="preserve">stripes widened ~J× over the dense cluster</w:t>
+            </w:r>
+          </w:p>
+        </w:tc>
+        <w:tc>
+          <w:p>
+            <w:pPr>
+              <w:pStyle w:val="Compact"/>
+              <w:jc w:val="left"/>
+            </w:pPr>
+            <w:r>
+              <w:t xml:space="preserve">FIG. 4</w:t>
+            </w:r>
+          </w:p>
+        </w:tc>
+      </w:tr>
+      <w:tr>
+        <w:tc>
+          <w:p>
+            <w:pPr>
+              <w:pStyle w:val="Compact"/>
+              <w:jc w:val="left"/>
+            </w:pPr>
+            <w:r>
+              <w:t xml:space="preserve">410</w:t>
+            </w:r>
+          </w:p>
+        </w:tc>
+        <w:tc>
+          <w:p>
+            <w:pPr>
+              <w:pStyle w:val="Compact"/>
+              <w:jc w:val="left"/>
+            </w:pPr>
+            <w:r>
+              <w:t xml:space="preserve">target temperature chosen on the lifetime budget</w:t>
+            </w:r>
+          </w:p>
+        </w:tc>
+        <w:tc>
+          <w:p>
+            <w:pPr>
+              <w:pStyle w:val="Compact"/>
+              <w:jc w:val="left"/>
+            </w:pPr>
+            <w:r>
+              <w:t xml:space="preserve">FIG. 4</w:t>
+            </w:r>
+          </w:p>
+        </w:tc>
+      </w:tr>
+      <w:tr>
+        <w:tc>
+          <w:p>
+            <w:pPr>
+              <w:pStyle w:val="Compact"/>
+              <w:jc w:val="left"/>
+            </w:pPr>
+            <w:r>
+              <w:t xml:space="preserve">110″</w:t>
+            </w:r>
+          </w:p>
+        </w:tc>
+        <w:tc>
+          <w:p>
+            <w:pPr>
+              <w:pStyle w:val="Compact"/>
+              <w:jc w:val="left"/>
+            </w:pPr>
+            <w:r>
+              <w:t xml:space="preserve">the 16× (460 W/mm²) execution unit</w:t>
+            </w:r>
+          </w:p>
+        </w:tc>
+        <w:tc>
+          <w:p>
+            <w:pPr>
+              <w:pStyle w:val="Compact"/>
+              <w:jc w:val="left"/>
+            </w:pPr>
+            <w:r>
+              <w:t xml:space="preserve">FIG. 5</w:t>
+            </w:r>
+          </w:p>
+        </w:tc>
+      </w:tr>
+      <w:tr>
+        <w:tc>
+          <w:p>
+            <w:pPr>
+              <w:pStyle w:val="Compact"/>
+              <w:jc w:val="left"/>
+            </w:pPr>
+            <w:r>
+              <w:t xml:space="preserve">502</w:t>
+            </w:r>
+          </w:p>
+        </w:tc>
+        <w:tc>
+          <w:p>
+            <w:pPr>
+              <w:pStyle w:val="Compact"/>
+              <w:jc w:val="left"/>
+            </w:pPr>
+            <w:r>
+              <w:t xml:space="preserve">tile pitch matched to the unit</w:t>
+            </w:r>
+          </w:p>
+        </w:tc>
+        <w:tc>
+          <w:p>
+            <w:pPr>
+              <w:pStyle w:val="Compact"/>
+              <w:jc w:val="left"/>
+            </w:pPr>
+            <w:r>
+              <w:t xml:space="preserve">FIG. 5</w:t>
+            </w:r>
+          </w:p>
+        </w:tc>
+      </w:tr>
+      <w:tr>
+        <w:tc>
+          <w:p>
+            <w:pPr>
+              <w:pStyle w:val="Compact"/>
+              <w:jc w:val="left"/>
+            </w:pPr>
+            <w:r>
+              <w:t xml:space="preserve">504</w:t>
+            </w:r>
+          </w:p>
+        </w:tc>
+        <w:tc>
+          <w:p>
+            <w:pPr>
+              <w:pStyle w:val="Compact"/>
+              <w:jc w:val="left"/>
+            </w:pPr>
+            <w:r>
+              <w:t xml:space="preserve">cold-tolerant hot-zone tile material over the cluster</w:t>
+            </w:r>
+          </w:p>
+        </w:tc>
+        <w:tc>
+          <w:p>
+            <w:pPr>
+              <w:pStyle w:val="Compact"/>
+              <w:jc w:val="left"/>
+            </w:pPr>
+            <w:r>
+              <w:t xml:space="preserve">FIG. 5</w:t>
+            </w:r>
+          </w:p>
+        </w:tc>
+      </w:tr>
+      <w:tr>
+        <w:tc>
+          <w:p>
+            <w:pPr>
+              <w:pStyle w:val="Compact"/>
+              <w:jc w:val="left"/>
+            </w:pPr>
+            <w:r>
+              <w:t xml:space="preserve">506</w:t>
+            </w:r>
+          </w:p>
+        </w:tc>
+        <w:tc>
+          <w:p>
+            <w:pPr>
+              <w:pStyle w:val="Compact"/>
+              <w:jc w:val="left"/>
+            </w:pPr>
+            <w:r>
+              <w:t xml:space="preserve">dual-material tile layout</w:t>
+            </w:r>
+          </w:p>
+        </w:tc>
+        <w:tc>
+          <w:p>
+            <w:pPr>
+              <w:pStyle w:val="Compact"/>
+              <w:jc w:val="left"/>
+            </w:pPr>
+            <w:r>
+              <w:t xml:space="preserve">FIG. 5</w:t>
+            </w:r>
+          </w:p>
+        </w:tc>
+      </w:tr>
+      <w:tr>
+        <w:tc>
+          <w:p>
+            <w:pPr>
+              <w:pStyle w:val="Compact"/>
+              <w:jc w:val="left"/>
+            </w:pPr>
+            <w:r>
+              <w:t xml:space="preserve">508</w:t>
+            </w:r>
+          </w:p>
+        </w:tc>
+        <w:tc>
+          <w:p>
+            <w:pPr>
+              <w:pStyle w:val="Compact"/>
+              <w:jc w:val="left"/>
+            </w:pPr>
+            <w:r>
+              <w:t xml:space="preserve">coarse pitch, conservation-bound</w:t>
+            </w:r>
+          </w:p>
+        </w:tc>
+        <w:tc>
+          <w:p>
+            <w:pPr>
+              <w:pStyle w:val="Compact"/>
+              <w:jc w:val="left"/>
+            </w:pPr>
+            <w:r>
+              <w:t xml:space="preserve">FIG. 5</w:t>
+            </w:r>
+          </w:p>
+        </w:tc>
+      </w:tr>
+      <w:tr>
+        <w:tc>
+          <w:p>
+            <w:pPr>
+              <w:pStyle w:val="Compact"/>
+              <w:jc w:val="left"/>
+            </w:pPr>
+            <w:r>
+              <w:t xml:space="preserve">610</w:t>
+            </w:r>
+          </w:p>
+        </w:tc>
+        <w:tc>
+          <w:p>
+            <w:pPr>
+              <w:pStyle w:val="Compact"/>
+              <w:jc w:val="left"/>
+            </w:pPr>
+            <w:r>
+              <w:t xml:space="preserve">storage die (L2 / L3 caches)</w:t>
+            </w:r>
+          </w:p>
+        </w:tc>
+        <w:tc>
+          <w:p>
+            <w:pPr>
+              <w:pStyle w:val="Compact"/>
+              <w:jc w:val="left"/>
+            </w:pPr>
+            <w:r>
+              <w:t xml:space="preserve">FIG. 6</w:t>
+            </w:r>
+          </w:p>
+        </w:tc>
+      </w:tr>
+      <w:tr>
+        <w:tc>
+          <w:p>
+            <w:pPr>
+              <w:pStyle w:val="Compact"/>
+              <w:jc w:val="left"/>
+            </w:pPr>
+            <w:r>
+              <w:t xml:space="preserve">612</w:t>
+            </w:r>
+          </w:p>
+        </w:tc>
+        <w:tc>
+          <w:p>
+            <w:pPr>
+              <w:pStyle w:val="Compact"/>
+              <w:jc w:val="left"/>
+            </w:pPr>
+            <w:r>
+              <w:t xml:space="preserve">Cr:LiSAF storage-zone tiles (~280 K)</w:t>
+            </w:r>
+          </w:p>
+        </w:tc>
+        <w:tc>
+          <w:p>
+            <w:pPr>
+              <w:pStyle w:val="Compact"/>
+              <w:jc w:val="left"/>
+            </w:pPr>
+            <w:r>
+              <w:t xml:space="preserve">FIG. 6</w:t>
+            </w:r>
+          </w:p>
+        </w:tc>
+      </w:tr>
+      <w:tr>
+        <w:tc>
+          <w:p>
+            <w:pPr>
+              <w:pStyle w:val="Compact"/>
+              <w:jc w:val="left"/>
+            </w:pPr>
+            <w:r>
+              <w:t xml:space="preserve">614</w:t>
+            </w:r>
+          </w:p>
+        </w:tc>
+        <w:tc>
+          <w:p>
+            <w:pPr>
+              <w:pStyle w:val="Compact"/>
+              <w:jc w:val="left"/>
+            </w:pPr>
+            <w:r>
+              <w:t xml:space="preserve">second sink, storage side</w:t>
+            </w:r>
+          </w:p>
+        </w:tc>
+        <w:tc>
+          <w:p>
+            <w:pPr>
+              <w:pStyle w:val="Compact"/>
+              <w:jc w:val="left"/>
+            </w:pPr>
+            <w:r>
+              <w:t xml:space="preserve">FIG. 6</w:t>
+            </w:r>
+          </w:p>
+        </w:tc>
+      </w:tr>
+      <w:tr>
+        <w:tc>
+          <w:p>
+            <w:pPr>
+              <w:pStyle w:val="Compact"/>
+              <w:jc w:val="left"/>
+            </w:pPr>
+            <w:r>
+              <w:t xml:space="preserve">620</w:t>
+            </w:r>
+          </w:p>
+        </w:tc>
+        <w:tc>
+          <w:p>
+            <w:pPr>
+              <w:pStyle w:val="Compact"/>
+              <w:jc w:val="left"/>
+            </w:pPr>
+            <w:r>
+              <w:t xml:space="preserve">bond / isolating interface</w:t>
+            </w:r>
+          </w:p>
+        </w:tc>
+        <w:tc>
+          <w:p>
+            <w:pPr>
+              <w:pStyle w:val="Compact"/>
+              <w:jc w:val="left"/>
+            </w:pPr>
+            <w:r>
+              <w:t xml:space="preserve">FIG. 6</w:t>
+            </w:r>
+          </w:p>
+        </w:tc>
+      </w:tr>
+      <w:tr>
+        <w:tc>
+          <w:p>
+            <w:pPr>
+              <w:pStyle w:val="Compact"/>
+              <w:jc w:val="left"/>
+            </w:pPr>
+            <w:r>
+              <w:t xml:space="preserve">630</w:t>
+            </w:r>
+          </w:p>
+        </w:tc>
+        <w:tc>
+          <w:p>
+            <w:pPr>
+              <w:pStyle w:val="Compact"/>
+              <w:jc w:val="left"/>
+            </w:pPr>
+            <w:r>
+              <w:t xml:space="preserve">interposer</w:t>
+            </w:r>
+          </w:p>
+        </w:tc>
+        <w:tc>
+          <w:p>
+            <w:pPr>
+              <w:pStyle w:val="Compact"/>
+              <w:jc w:val="left"/>
+            </w:pPr>
+            <w:r>
+              <w:t xml:space="preserve">FIG. 6</w:t>
+            </w:r>
+          </w:p>
+        </w:tc>
+      </w:tr>
+      <w:tr>
+        <w:tc>
+          <w:p>
+            <w:pPr>
+              <w:pStyle w:val="Compact"/>
+              <w:jc w:val="left"/>
+            </w:pPr>
+            <w:r>
+              <w:t xml:space="preserve">632</w:t>
+            </w:r>
+          </w:p>
+        </w:tc>
+        <w:tc>
+          <w:p>
+            <w:pPr>
+              <w:pStyle w:val="Compact"/>
+              <w:jc w:val="left"/>
+            </w:pPr>
+            <w:r>
+              <w:t xml:space="preserve">isolating channel</w:t>
+            </w:r>
+          </w:p>
+        </w:tc>
+        <w:tc>
+          <w:p>
+            <w:pPr>
+              <w:pStyle w:val="Compact"/>
+              <w:jc w:val="left"/>
+            </w:pPr>
+            <w:r>
+              <w:t xml:space="preserve">FIG. 6</w:t>
+            </w:r>
+          </w:p>
+        </w:tc>
+      </w:tr>
+      <w:tr>
+        <w:tc>
+          <w:p>
+            <w:pPr>
+              <w:pStyle w:val="Compact"/>
+              <w:jc w:val="left"/>
+            </w:pPr>
+            <w:r>
+              <w:t xml:space="preserve">100′</w:t>
+            </w:r>
+          </w:p>
+        </w:tc>
+        <w:tc>
+          <w:p>
+            <w:pPr>
+              <w:pStyle w:val="Compact"/>
+              <w:jc w:val="left"/>
+            </w:pPr>
+            <w:r>
+              <w:t xml:space="preserve">the evolved core</w:t>
+            </w:r>
+          </w:p>
+        </w:tc>
+        <w:tc>
+          <w:p>
+            <w:pPr>
+              <w:pStyle w:val="Compact"/>
+              <w:jc w:val="left"/>
+            </w:pPr>
+            <w:r>
+              <w:t xml:space="preserve">FIG. 7</w:t>
+            </w:r>
+          </w:p>
+        </w:tc>
+      </w:tr>
+      <w:tr>
+        <w:tc>
+          <w:p>
+            <w:pPr>
+              <w:pStyle w:val="Compact"/>
+              <w:jc w:val="left"/>
+            </w:pPr>
+            <w:r>
+              <w:t xml:space="preserve">700</w:t>
+            </w:r>
+          </w:p>
+        </w:tc>
+        <w:tc>
+          <w:p>
+            <w:pPr>
+              <w:pStyle w:val="Compact"/>
+              <w:jc w:val="left"/>
+            </w:pPr>
+            <w:r>
+              <w:t xml:space="preserve">low-threshold cells restricted to the cooled cluster (ARGUED)</w:t>
+            </w:r>
+          </w:p>
+        </w:tc>
+        <w:tc>
+          <w:p>
+            <w:pPr>
+              <w:pStyle w:val="Compact"/>
+              <w:jc w:val="left"/>
+            </w:pPr>
+            <w:r>
+              <w:t xml:space="preserve">FIG. 7</w:t>
+            </w:r>
+          </w:p>
+        </w:tc>
+      </w:tr>
+    </w:tbl>
+    <w:p>
+      <w:pPr>
+        <w:pStyle w:val="BodyText"/>
+      </w:pPr>
+      <w:r>
+        <w:rPr>
+          <w:rStyle w:val="VerbatimChar"/>
+        </w:rPr>
+        <w:t xml:space="preserve">[!]</w:t>
+      </w:r>
+      <w:r>
+        <w:t xml:space="preserve"> </w:t>
+      </w:r>
+      <w:r>
+        <w:t xml:space="preserve">What the drawings do not show: a rail model (402 is a current-density statement), the two-sink stack solved (FIG. 6b/c are the next build), the 16× unit at a grid that resolves it (its holds are lower bounds), and anything above 3.50 W/mm² on the reference die.</w:t>
+      </w:r>
+    </w:p>
+    <w:p>
+      <w:pPr>
+        <w:pStyle w:val="Heading2"/>
+      </w:pPr>
+      <w:bookmarkStart w:id="54" w:name="experiments-run-for-this-memo"/>
       <w:r>
         <w:t xml:space="preserve">8. Experiments run for this memo</w:t>
       </w:r>
-      <w:bookmarkEnd w:id="41"/>
+      <w:bookmarkEnd w:id="54"/>
     </w:p>
     <w:p>
       <w:pPr>
@@ -5579,6 +8189,53 @@
         <w:rPr>
           <w:b/>
         </w:rPr>
+        <w:t xml:space="preserve">The generalized f_max and the densified-cluster ladder (§P0.31–§P0.32, 13 Sep).</w:t>
+      </w:r>
+      <w:r>
+        <w:t xml:space="preserve"> </w:t>
+      </w:r>
+      <w:r>
+        <w:t xml:space="preserve">(a) A period model with wire, thermal skew (read from each solve) and setup/jitter, anchored once at the trace, with V_max from an Arrhenius reliability budget (EM Black n = 2 / 0.9 eV, TDDB power law n = 40 / 0.6 eV; the qualification point 0.77 V at 100 °C restated): at the 92 °C target the overdrive buys +1.6 % of clock, at 60 °C +8 %, at 27 °C +16 %; TDDB binds at every temperature below the corner; 10 GHz needs a 6–7 FO4 pipeline (</w:t>
+      </w:r>
+      <w:r>
+        <w:rPr>
+          <w:rStyle w:val="VerbatimChar"/>
+        </w:rPr>
+        <w:t xml:space="preserve">docs/evidence/fmax_model.json</w:t>
+      </w:r>
+      <w:r>
+        <w:t xml:space="preserve">; the coupled search</w:t>
+      </w:r>
+      <w:r>
+        <w:t xml:space="preserve"> </w:t>
+      </w:r>
+      <w:r>
+        <w:rPr>
+          <w:rStyle w:val="VerbatimChar"/>
+        </w:rPr>
+        <w:t xml:space="preserve">clock_fmax.json</w:t>
+      </w:r>
+      <w:r>
+        <w:t xml:space="preserve">). (b) The 8× / 16× execution clusters (230 / 460 W/mm² cALUs) at 20 µm and 5 µm burial and 200 / 100 µm pitch, matched die watts, per-block shape: the 8× holds to 202 W everywhere, the 16× only at 100 µm pitch; the top rung is lost to conservation (coarse pitch) or to the dye’s cold end (fine pitch: tiles at 253–254 K asked for 170–200 W/mm²) — the first rows where the film binds; premium 1.8–1.9× over the reference at the same geometry; and the reference itself is 14–31 % cheaper at 5–20 µm burial than at 200 µm under this shape (</w:t>
+      </w:r>
+      <w:r>
+        <w:rPr>
+          <w:rStyle w:val="VerbatimChar"/>
+        </w:rPr>
+        <w:t xml:space="preserve">docs/evidence/cluster_transport.json</w:t>
+      </w:r>
+      <w:r>
+        <w:t xml:space="preserve">).</w:t>
+      </w:r>
+    </w:p>
+    <w:p>
+      <w:pPr>
+        <w:pStyle w:val="BodyText"/>
+      </w:pPr>
+      <w:r>
+        <w:rPr>
+          <w:b/>
+        </w:rPr>
         <w:t xml:space="preserve">Recommended next experiments (not run):</w:t>
       </w:r>
       <w:r>
@@ -5610,7 +8267,7 @@
       <w:pPr>
         <w:pStyle w:val="Heading3"/>
       </w:pPr>
-      <w:bookmarkStart w:id="42" w:name="X3cf1177346fd9d00a85ca42d28b3524fad73c3b"/>
+      <w:bookmarkStart w:id="55" w:name="X3cf1177346fd9d00a85ca42d28b3524fad73c3b"/>
       <w:r>
         <w:t xml:space="preserve">8.1 Integration-ladder results (landed 12 Sep;</w:t>
       </w:r>
@@ -5638,7 +8295,7 @@
       <w:r>
         <w:t xml:space="preserve">)</w:t>
       </w:r>
-      <w:bookmarkEnd w:id="42"/>
+      <w:bookmarkEnd w:id="55"/>
     </w:p>
     <w:tbl>
       <w:tblPr>
@@ -6326,7 +8983,90 @@
         <w:rPr>
           <w:b/>
         </w:rPr>
-        <w:t xml:space="preserve">What it says.</w:t>
+        <w:t xml:space="preserve">Superseded in part on 13 Sep (§P0.32): this ladder ran the planner’s uniform</w:t>
+      </w:r>
+      <w:r>
+        <w:rPr>
+          <w:b/>
+        </w:rPr>
+        <w:t xml:space="preserve"> </w:t>
+      </w:r>
+      <w:r>
+        <w:rPr>
+          <w:b/>
+        </w:rPr>
+        <w:t xml:space="preserve">“</w:t>
+      </w:r>
+      <w:r>
+        <w:rPr>
+          <w:b/>
+        </w:rPr>
+        <w:t xml:space="preserve">seed</w:t>
+      </w:r>
+      <w:r>
+        <w:rPr>
+          <w:b/>
+        </w:rPr>
+        <w:t xml:space="preserve">”</w:t>
+      </w:r>
+      <w:r>
+        <w:rPr>
+          <w:b/>
+        </w:rPr>
+        <w:t xml:space="preserve"> </w:t>
+      </w:r>
+      <w:r>
+        <w:rPr>
+          <w:b/>
+        </w:rPr>
+        <w:t xml:space="preserve">envelope shape; under the per-block shape the reference’s plans at 20 µm and 5 µm burial are 14–31 % BELOW the 200 µm-burial plans (202 W: 78–97 W against 114; 243 W: 139–160 against 177, at 100–200 µm pitch), so the</w:t>
+      </w:r>
+      <w:r>
+        <w:rPr>
+          <w:b/>
+        </w:rPr>
+        <w:t xml:space="preserve"> </w:t>
+      </w:r>
+      <w:r>
+        <w:rPr>
+          <w:b/>
+        </w:rPr>
+        <w:t xml:space="preserve">“</w:t>
+      </w:r>
+      <w:r>
+        <w:rPr>
+          <w:b/>
+        </w:rPr>
+        <w:t xml:space="preserve">no thermal advantage from integration</w:t>
+      </w:r>
+      <w:r>
+        <w:rPr>
+          <w:b/>
+        </w:rPr>
+        <w:t xml:space="preserve">”</w:t>
+      </w:r>
+      <w:r>
+        <w:rPr>
+          <w:b/>
+        </w:rPr>
+        <w:t xml:space="preserve"> </w:t>
+      </w:r>
+      <w:r>
+        <w:rPr>
+          <w:b/>
+        </w:rPr>
+        <w:t xml:space="preserve">reading below is the seed planner’s, not the die’s. The structural reading (claim the decoupled form as an embodiment) stands.</w:t>
+      </w:r>
+    </w:p>
+    <w:p>
+      <w:pPr>
+        <w:pStyle w:val="BodyText"/>
+      </w:pPr>
+      <w:r>
+        <w:rPr>
+          <w:b/>
+        </w:rPr>
+        <w:t xml:space="preserve">What it says (seed shape, as run).</w:t>
       </w:r>
       <w:r>
         <w:t xml:space="preserve"> </w:t>
@@ -6379,7 +9119,52 @@
         <w:t xml:space="preserve"> </w:t>
       </w:r>
       <w:r>
-        <w:t xml:space="preserve">(the two-sided stack of Section 6.7, the density co-design of Section 6.6, finer pitch where the silicon spreads less) rather than for a thermal advantage the simulations do not show. Caveats: 100 µm grid; the 3.00 W/mm² rows are under the injected energy cap; the planner’s envelope shape is the uniform seed shape, and a per-block shape may favour finer pitch at shallow burial (open).</w:t>
+        <w:t xml:space="preserve">(the two-sided stack of Section 6.7, the density co-design of Section 6.6, finer pitch where the silicon spreads less) rather than for a thermal advantage the simulations do not show. Caveats: 100 µm grid; the 3.00 W/mm² rows are under the injected energy cap; the planner’s envelope shape is the uniform seed shape —</w:t>
+      </w:r>
+      <w:r>
+        <w:t xml:space="preserve"> </w:t>
+      </w:r>
+      <w:r>
+        <w:rPr>
+          <w:b/>
+        </w:rPr>
+        <w:t xml:space="preserve">and the per-block shape does favour shallow burial and finer pitch (measured 13 Sep, §P0.32: −14 to −31 % at 5–20 µm), so</w:t>
+      </w:r>
+      <w:r>
+        <w:rPr>
+          <w:b/>
+        </w:rPr>
+        <w:t xml:space="preserve"> </w:t>
+      </w:r>
+      <w:r>
+        <w:rPr>
+          <w:b/>
+        </w:rPr>
+        <w:t xml:space="preserve">“</w:t>
+      </w:r>
+      <w:r>
+        <w:rPr>
+          <w:b/>
+        </w:rPr>
+        <w:t xml:space="preserve">within 10 %</w:t>
+      </w:r>
+      <w:r>
+        <w:rPr>
+          <w:b/>
+        </w:rPr>
+        <w:t xml:space="preserve">”</w:t>
+      </w:r>
+      <w:r>
+        <w:rPr>
+          <w:b/>
+        </w:rPr>
+        <w:t xml:space="preserve"> </w:t>
+      </w:r>
+      <w:r>
+        <w:rPr>
+          <w:b/>
+        </w:rPr>
+        <w:t xml:space="preserve">is withdrawn as a thermal statement; the decoupled form should be claimed as an embodiment, not as cost-equivalent.</w:t>
       </w:r>
     </w:p>
     <w:p>
@@ -6402,7 +9187,7 @@
                     </pic:cNvPicPr>
                   </pic:nvPicPr>
                   <pic:blipFill>
-                    <a:blip r:embed="rId43"/>
+                    <a:blip r:embed="rId56"/>
                     <a:stretch>
                       <a:fillRect/>
                     </a:stretch>
@@ -6448,11 +9233,11 @@
       <w:pPr>
         <w:pStyle w:val="Heading2"/>
       </w:pPr>
-      <w:bookmarkStart w:id="44" w:name="Xa656942d5b10563144e01bc8233df99af998a73"/>
+      <w:bookmarkStart w:id="57" w:name="Xa656942d5b10563144e01bc8233df99af998a73"/>
       <w:r>
         <w:t xml:space="preserve">9. Appendix — evidence pointers and the standing rules</w:t>
       </w:r>
-      <w:bookmarkEnd w:id="44"/>
+      <w:bookmarkEnd w:id="57"/>
     </w:p>
     <w:p>
       <w:pPr>
@@ -6637,7 +9422,7 @@
                     </pic:cNvPicPr>
                   </pic:nvPicPr>
                   <pic:blipFill>
-                    <a:blip r:embed="rId45"/>
+                    <a:blip r:embed="rId58"/>
                     <a:stretch>
                       <a:fillRect/>
                     </a:stretch>

</xml_diff>